<commit_message>
Copy pass: rewrite all site copy in natural spoken Hebrew, update the copywriter doc
Co-Authored-By: Claude Opus 5 <noreply@anthropic.com>
</commit_message>
<xml_diff>
--- a/docs/thai-secret-copy.docx
+++ b/docs/thai-secret-copy.docx
@@ -105,7 +105,7 @@
           <w:rtl/>
           <w:rFonts w:ascii="Arial" w:cs="Arial" w:eastAsia="Arial" w:hAnsi="Arial"/>
         </w:rPr>
-        <w:t xml:space="preserve">גרסה: 20/09/2026</w:t>
+        <w:t xml:space="preserve">גרסה: 24/09/2026 (אחרי מעבר קופי)</w:t>
       </w:r>
     </w:p>
     <w:p>
@@ -142,7 +142,7 @@
           <w:rtl/>
           <w:rFonts w:ascii="Arial" w:cs="Arial" w:eastAsia="Arial" w:hAnsi="Arial"/>
         </w:rPr>
-        <w:t xml:space="preserve">המסמך מסודר לפי עמוד, ובתוך כל עמוד לפי אזורים מלמעלה למטה, בדיוק בסדר שבו הגולש רואה אותם. בכל טבלה: העמודה הימנית היא שם האלמנט, האמצעית היא הטקסט שקיים היום באתר, והשמאלית היא הערות ומגבלות. כתבו את הנוסח החדש ליד הנוסח הקיים או בעמודה נפרדת, ואל תשנו את שמות האלמנטים כדי שנוכל להעלות את הטקסטים לאתר אחד לאחד.</w:t>
+        <w:t xml:space="preserve">המסמך מסודר לפי עמוד, ובתוך כל עמוד לפי אזורים מלמעלה למטה, בדיוק בסדר שבו הגולש רואה אותם. בכל טבלה: העמודה הימנית היא שם האלמנט, האמצעית היא הטקסט שקיים באתר כרגע, והשמאלית היא הערות ומגבלות. אל תשנו את שמות האלמנטים, כדי שנוכל להעלות נוסח חדש לאתר אחד לאחד.</w:t>
       </w:r>
     </w:p>
     <w:p>
@@ -200,7 +200,7 @@
           <w:rtl/>
           <w:rFonts w:ascii="Arial" w:cs="Arial" w:eastAsia="Arial" w:hAnsi="Arial"/>
         </w:rPr>
-        <w:t xml:space="preserve">קופסה אחת 249 ₪. שתי קופסאות 419 ₪ (חיסכון 79 ₪). המשלוח כלול במחיר. התשלום מתבצע רק אחרי שיחת אישור: ביט, פייבוקס או מזומן.</w:t>
+        <w:t xml:space="preserve">קופסה אחת 249 ₪. שתי קופסאות 419 ₪ (חוסכים 79 ₪). המשלוח כלול במחיר. באתר לא משלמים כלום: אנחנו מתקשרים לאשר, ורק אז מתאמים תשלום בביט, בפייבוקס או במזומן.</w:t>
       </w:r>
     </w:p>
     <w:p>
@@ -229,7 +229,7 @@
           <w:rtl/>
           <w:rFonts w:ascii="Arial" w:cs="Arial" w:eastAsia="Arial" w:hAnsi="Arial"/>
         </w:rPr>
-        <w:t xml:space="preserve">נשים בישראל שעושות החלקות, צבע או הבהרה ומרגישות שהשיער יבש ומחוספס. קונות דרך אינסטגרם וטיקטוק, מהנייד, מהר.</w:t>
+        <w:t xml:space="preserve">בעיקר נשים בישראל שעושות החלקות, צבע או הבהרה, ומרגישות שהשיער יבש ומחוספס. מגיעות מאינסטגרם וטיקטוק, גולשות מהנייד, מחליטות מהר.</w:t>
       </w:r>
     </w:p>
     <w:p>
@@ -258,7 +258,36 @@
           <w:rtl/>
           <w:rFonts w:ascii="Arial" w:cs="Arial" w:eastAsia="Arial" w:hAnsi="Arial"/>
         </w:rPr>
-        <w:t xml:space="preserve">ישיר, בטוח, קצר. משפטים קצרים. בלי סופרלטיבים ריקים, בלי הבטחות רפואיות (המוצר קוסמטי). דיבור בגוף שני, פנייה לאישה או ניסוח ניטרלי.</w:t>
+        <w:t xml:space="preserve">ישיר, בטוח, קצר. משפטים קצרים, עברית מדוברת ונכונה. בלי סופרלטיבים ריקים ובלי הבטחות רפואיות (המוצר קוסמטי, לא תרופה).</w:t>
+      </w:r>
+    </w:p>
+    <w:p>
+      <w:pPr>
+        <w:bidi/>
+        <w:spacing w:before="60" w:after="60" w:line="300"/>
+        <w:jc w:val="right"/>
+      </w:pPr>
+      <w:r>
+        <w:rPr>
+          <w:b/>
+          <w:bCs/>
+          <w:color w:val="171512"/>
+          <w:sz w:val="22"/>
+          <w:szCs w:val="22"/>
+          <w:rtl/>
+          <w:rFonts w:ascii="Arial" w:cs="Arial" w:eastAsia="Arial" w:hAnsi="Arial"/>
+        </w:rPr>
+        <w:t xml:space="preserve">מגדר: </w:t>
+      </w:r>
+      <w:r>
+        <w:rPr>
+          <w:color w:val="171512"/>
+          <w:sz w:val="22"/>
+          <w:szCs w:val="22"/>
+          <w:rtl/>
+          <w:rFonts w:ascii="Arial" w:cs="Arial" w:eastAsia="Arial" w:hAnsi="Arial"/>
+        </w:rPr>
+        <w:t xml:space="preserve">האתר כתוב בניסוח שלא נוטה למגדר: פנייה ברבים ("הזמינו", "ממלאים", "מורחים"). זה מאפשר גם לגברים ולמי שקונה במתנה להרגיש בבית. אם נחליט לפנות לנשים ביחיד, צריך לשנות את זה בכל האתר, לא רק בחלקים.</w:t>
       </w:r>
     </w:p>
     <w:p>
@@ -287,7 +316,7 @@
           <w:rtl/>
           <w:rFonts w:ascii="Arial" w:cs="Arial" w:eastAsia="Arial" w:hAnsi="Arial"/>
         </w:rPr>
-        <w:t xml:space="preserve">אין להשתמש בקו מפריד ארוך (em dash), רק במקף רגיל. כותרות בסרט: עד 4 מילים. כותרת סקשן: עד 6 מילים. כפתור ראשי: אותו פועל בכל האתר ("הזמינו עכשיו"). מספרים ומחירים תמיד בספרות.</w:t>
+        <w:t xml:space="preserve">אין להשתמש בקו מפריד ארוך, רק במקף רגיל או בפסיק. כותרת בסרט: עד 4 מילים. כותרת ראשית: עד 8 מילים. כותרת סקשן: עד 6 מילים. כפתור ראשי: אותו פועל בכל האתר ("הזמינו עכשיו"). מספרים ומחירים תמיד בספרות. סימן קריאה אחד לכל היותר, ורק כשמגיע לו.</w:t>
       </w:r>
     </w:p>
     <w:p>
@@ -446,7 +475,7 @@
                 <w:rtl/>
                 <w:rFonts w:ascii="Arial" w:cs="Arial" w:eastAsia="Arial" w:hAnsi="Arial"/>
               </w:rPr>
-              <w:t xml:space="preserve">הטקסט הנוכחי באתר</w:t>
+              <w:t xml:space="preserve">הטקסט באתר</w:t>
             </w:r>
           </w:p>
         </w:tc>
@@ -483,7 +512,7 @@
                 <w:rtl/>
                 <w:rFonts w:ascii="Arial" w:cs="Arial" w:eastAsia="Arial" w:hAnsi="Arial"/>
               </w:rPr>
-              <w:t xml:space="preserve">הערות לקופירייטר</w:t>
+              <w:t xml:space="preserve">הערות ומגבלות</w:t>
             </w:r>
           </w:p>
         </w:tc>
@@ -553,7 +582,7 @@
                 <w:rtl/>
                 <w:rFonts w:ascii="Arial" w:cs="Arial" w:eastAsia="Arial" w:hAnsi="Arial"/>
               </w:rPr>
-              <w:t xml:space="preserve">תאי סיקרט | Green Bio Super Treatment - מסכת שיער מתאילנד, 24 שקיות</w:t>
+              <w:t xml:space="preserve">תאי סיקרט | Green Bio Super Treatment - טיפול שיער מתאילנד, 24 שקיות</w:t>
             </w:r>
           </w:p>
         </w:tc>
@@ -657,7 +686,7 @@
                 <w:rtl/>
                 <w:rFonts w:ascii="Arial" w:cs="Arial" w:eastAsia="Arial" w:hAnsi="Arial"/>
               </w:rPr>
-              <w:t xml:space="preserve">Green Bio Super Treatment Cream - טיפול שיער עמוק מתאילנד לשיער אחרי החלקה, צבע או הבהרה. 24 שקיות של 30 מ״ל (720 מ״ל). קרטין, תמצית משי ושמן חמניות. 2 עד 5 דקות ושוטפים. משלוח כלול.</w:t>
+              <w:t xml:space="preserve">טיפול עומק לשיער אחרי החלקה, צבע או הבהרה. 24 שקיות, 2 עד 5 דקות לטיפול, בלי חום ובלי מספרה. 249 ₪ כולל משלוח, ומשלמים רק אחרי שיחת אישור.</w:t>
             </w:r>
           </w:p>
         </w:tc>
@@ -865,7 +894,7 @@
                 <w:rtl/>
                 <w:rFonts w:ascii="Arial" w:cs="Arial" w:eastAsia="Arial" w:hAnsi="Arial"/>
               </w:rPr>
-              <w:t xml:space="preserve">הטיפול מתאילנד שמחזיר לשיער את הברק אחרי החלקה, צבע או הבהרה. 24 שקיות, 249 ₪, משלוח כלול.</w:t>
+              <w:t xml:space="preserve">מה שההחלקה והצבע לקחו מהשיער, הקרם מתאילנד מחזיר. 24 טיפולים בקופסה, 249 ₪ כולל משלוח.</w:t>
             </w:r>
           </w:p>
         </w:tc>
@@ -1017,7 +1046,7 @@
                 <w:rtl/>
                 <w:rFonts w:ascii="Arial" w:cs="Arial" w:eastAsia="Arial" w:hAnsi="Arial"/>
               </w:rPr>
-              <w:t xml:space="preserve">הטקסט הנוכחי באתר</w:t>
+              <w:t xml:space="preserve">הטקסט באתר</w:t>
             </w:r>
           </w:p>
         </w:tc>
@@ -1054,7 +1083,7 @@
                 <w:rtl/>
                 <w:rFonts w:ascii="Arial" w:cs="Arial" w:eastAsia="Arial" w:hAnsi="Arial"/>
               </w:rPr>
-              <w:t xml:space="preserve">הערות לקופירייטר</w:t>
+              <w:t xml:space="preserve">הערות ומגבלות</w:t>
             </w:r>
           </w:p>
         </w:tc>
@@ -1380,7 +1409,7 @@
                 <w:rtl/>
                 <w:rFonts w:ascii="Arial" w:cs="Arial" w:eastAsia="Arial" w:hAnsi="Arial"/>
               </w:rPr>
-              <w:t xml:space="preserve">הטקסט הנוכחי באתר</w:t>
+              <w:t xml:space="preserve">הטקסט באתר</w:t>
             </w:r>
           </w:p>
         </w:tc>
@@ -1417,7 +1446,7 @@
                 <w:rtl/>
                 <w:rFonts w:ascii="Arial" w:cs="Arial" w:eastAsia="Arial" w:hAnsi="Arial"/>
               </w:rPr>
-              <w:t xml:space="preserve">הערות לקופירייטר</w:t>
+              <w:t xml:space="preserve">הערות ומגבלות</w:t>
             </w:r>
           </w:p>
         </w:tc>
@@ -2083,7 +2112,7 @@
           <w:rtl/>
           <w:rFonts w:ascii="Arial" w:cs="Arial" w:eastAsia="Arial" w:hAnsi="Arial"/>
         </w:rPr>
-        <w:t xml:space="preserve">הסרט הוא הדבר הראשון שרואים. כל סצנה מקבלת כרטיס טקסט קטן על גבי התמונה. הטקסט חייב להיות קצר מאוד: שורת פתיח (עד 5 מילים), כותרת (עד 4 מילים), שורת גוף (עד 2 משפטים קצרים).</w:t>
+        <w:t xml:space="preserve">הסרט הוא הדבר הראשון שרואים, והטקסט יושב על גבי התמונה בכרטיס קטן. לכן הוא חייב להיות קצר מאוד: שורת פתיח (עד 5 מילים), כותרת (עד 4 מילים), שורת גוף (עד 2 משפטים קצרים).</w:t>
       </w:r>
     </w:p>
     <w:p>
@@ -2197,7 +2226,7 @@
                 <w:rtl/>
                 <w:rFonts w:ascii="Arial" w:cs="Arial" w:eastAsia="Arial" w:hAnsi="Arial"/>
               </w:rPr>
-              <w:t xml:space="preserve">הטקסט הנוכחי באתר</w:t>
+              <w:t xml:space="preserve">הטקסט באתר</w:t>
             </w:r>
           </w:p>
         </w:tc>
@@ -2234,7 +2263,7 @@
                 <w:rtl/>
                 <w:rFonts w:ascii="Arial" w:cs="Arial" w:eastAsia="Arial" w:hAnsi="Arial"/>
               </w:rPr>
-              <w:t xml:space="preserve">הערות לקופירייטר</w:t>
+              <w:t xml:space="preserve">הערות ומגבלות</w:t>
             </w:r>
           </w:p>
         </w:tc>
@@ -2304,7 +2333,7 @@
                 <w:rtl/>
                 <w:rFonts w:ascii="Arial" w:cs="Arial" w:eastAsia="Arial" w:hAnsi="Arial"/>
               </w:rPr>
-              <w:t xml:space="preserve">תאי סיקרט · Green Bio</w:t>
+              <w:t xml:space="preserve">אחרי החלקה, צבע או הבהרה</w:t>
             </w:r>
           </w:p>
         </w:tc>
@@ -2338,7 +2367,7 @@
                 <w:rtl/>
                 <w:rFonts w:ascii="Arial" w:cs="Arial" w:eastAsia="Arial" w:hAnsi="Arial"/>
               </w:rPr>
-              <w:t xml:space="preserve">מותג + מוצר.</w:t>
+              <w:t xml:space="preserve">ממקד את הקהל בשורה הראשונה.</w:t>
             </w:r>
           </w:p>
         </w:tc>
@@ -2408,7 +2437,7 @@
                 <w:rtl/>
                 <w:rFonts w:ascii="Arial" w:cs="Arial" w:eastAsia="Arial" w:hAnsi="Arial"/>
               </w:rPr>
-              <w:t xml:space="preserve">השיער שלך מגיע לכאן עייף</w:t>
+              <w:t xml:space="preserve">השיער שילם את המחיר</w:t>
             </w:r>
           </w:p>
         </w:tc>
@@ -2512,7 +2541,7 @@
                 <w:rtl/>
                 <w:rFonts w:ascii="Arial" w:cs="Arial" w:eastAsia="Arial" w:hAnsi="Arial"/>
               </w:rPr>
-              <w:t xml:space="preserve">החלקה, צבע, הבהרה. הטיפול מתאילנד שמחזיר את מה שהכימיה לקחה.</w:t>
+              <w:t xml:space="preserve">הקרם מתאילנד שמחזיר לו את הרכות והברק. שקית אחת, 5 דקות במקלחת, פעם בשבוע.</w:t>
             </w:r>
           </w:p>
         </w:tc>
@@ -2766,7 +2795,7 @@
                 <w:rtl/>
                 <w:rFonts w:ascii="Arial" w:cs="Arial" w:eastAsia="Arial" w:hAnsi="Arial"/>
               </w:rPr>
-              <w:t xml:space="preserve">הטקסט הנוכחי באתר</w:t>
+              <w:t xml:space="preserve">הטקסט באתר</w:t>
             </w:r>
           </w:p>
         </w:tc>
@@ -2803,7 +2832,7 @@
                 <w:rtl/>
                 <w:rFonts w:ascii="Arial" w:cs="Arial" w:eastAsia="Arial" w:hAnsi="Arial"/>
               </w:rPr>
-              <w:t xml:space="preserve">הערות לקופירייטר</w:t>
+              <w:t xml:space="preserve">הערות ומגבלות</w:t>
             </w:r>
           </w:p>
         </w:tc>
@@ -2873,7 +2902,7 @@
                 <w:rtl/>
                 <w:rFonts w:ascii="Arial" w:cs="Arial" w:eastAsia="Arial" w:hAnsi="Arial"/>
               </w:rPr>
-              <w:t xml:space="preserve">שקית אחת. 2 עד 5 דקות.</w:t>
+              <w:t xml:space="preserve">בלי חום, בלי אדים, בלי מספרה</w:t>
             </w:r>
           </w:p>
         </w:tc>
@@ -2907,6 +2936,7 @@
                 <w:rtl/>
                 <w:rFonts w:ascii="Arial" w:cs="Arial" w:eastAsia="Arial" w:hAnsi="Arial"/>
               </w:rPr>
+              <w:t xml:space="preserve">שלוש התנגדויות בשורה אחת.</w:t>
             </w:r>
           </w:p>
         </w:tc>
@@ -3080,7 +3110,7 @@
                 <w:rtl/>
                 <w:rFonts w:ascii="Arial" w:cs="Arial" w:eastAsia="Arial" w:hAnsi="Arial"/>
               </w:rPr>
-              <w:t xml:space="preserve">קרם עשיר עם קרטין ותמצית משי. שקית אחת = טיפול אחד מלא.</w:t>
+              <w:t xml:space="preserve">קרטין, תמצית משי ושמן חמניות. שקית אחת היא טיפול שלם, בלי לנחש כמות.</w:t>
             </w:r>
           </w:p>
         </w:tc>
@@ -3230,7 +3260,7 @@
                 <w:rtl/>
                 <w:rFonts w:ascii="Arial" w:cs="Arial" w:eastAsia="Arial" w:hAnsi="Arial"/>
               </w:rPr>
-              <w:t xml:space="preserve">הטקסט הנוכחי באתר</w:t>
+              <w:t xml:space="preserve">הטקסט באתר</w:t>
             </w:r>
           </w:p>
         </w:tc>
@@ -3267,7 +3297,7 @@
                 <w:rtl/>
                 <w:rFonts w:ascii="Arial" w:cs="Arial" w:eastAsia="Arial" w:hAnsi="Arial"/>
               </w:rPr>
-              <w:t xml:space="preserve">הערות לקופירייטר</w:t>
+              <w:t xml:space="preserve">הערות ומגבלות</w:t>
             </w:r>
           </w:p>
         </w:tc>
@@ -3474,7 +3504,7 @@
                 <w:rtl/>
                 <w:rFonts w:ascii="Arial" w:cs="Arial" w:eastAsia="Arial" w:hAnsi="Arial"/>
               </w:rPr>
-              <w:t xml:space="preserve">עד 4 מילים. זו שורת המחץ של הסרט.</w:t>
+              <w:t xml:space="preserve">עד 4 מילים. שורת המחץ של הסרט.</w:t>
             </w:r>
           </w:p>
         </w:tc>
@@ -3648,7 +3678,7 @@
                 <w:rtl/>
                 <w:rFonts w:ascii="Arial" w:cs="Arial" w:eastAsia="Arial" w:hAnsi="Arial"/>
               </w:rPr>
-              <w:t xml:space="preserve">מבצע זוג 419 ₪</w:t>
+              <w:t xml:space="preserve">2 קופסאות 419 ₪</w:t>
             </w:r>
           </w:p>
         </w:tc>
@@ -3904,7 +3934,7 @@
                 <w:rtl/>
                 <w:rFonts w:ascii="Arial" w:cs="Arial" w:eastAsia="Arial" w:hAnsi="Arial"/>
               </w:rPr>
-              <w:t xml:space="preserve">הטקסט הנוכחי באתר</w:t>
+              <w:t xml:space="preserve">הטקסט באתר</w:t>
             </w:r>
           </w:p>
         </w:tc>
@@ -3941,7 +3971,7 @@
                 <w:rtl/>
                 <w:rFonts w:ascii="Arial" w:cs="Arial" w:eastAsia="Arial" w:hAnsi="Arial"/>
               </w:rPr>
-              <w:t xml:space="preserve">הערות לקופירייטר</w:t>
+              <w:t xml:space="preserve">הערות ומגבלות</w:t>
             </w:r>
           </w:p>
         </w:tc>
@@ -4148,7 +4178,7 @@
                 <w:rtl/>
                 <w:rFonts w:ascii="Arial" w:cs="Arial" w:eastAsia="Arial" w:hAnsi="Arial"/>
               </w:rPr>
-              <w:t xml:space="preserve">שם המוצר. אפשר להוסיף כותרת בעברית לידו.</w:t>
+              <w:t xml:space="preserve">שם המוצר, חשוב גם לגוגל.</w:t>
             </w:r>
           </w:p>
         </w:tc>
@@ -4218,7 +4248,7 @@
                 <w:rtl/>
                 <w:rFonts w:ascii="Arial" w:cs="Arial" w:eastAsia="Arial" w:hAnsi="Arial"/>
               </w:rPr>
-              <w:t xml:space="preserve">מסכת טיפול עמוק מתאילנד לשיער שעבר טיפול כימי. קופסה אחת = 24 שקיות של 30 מ״ל, 720 מ״ל סך הכל. שקית לכל טיפול, בלי לנחש כמויות.</w:t>
+              <w:t xml:space="preserve">מסכת טיפול עמוק מתאילנד, לשיער שעבר החלקה, צבע או הבהרה. בקופסה 24 שקיות, וכל אחת היא טיפול שלם. בטיפול פעם בשבוע זה מחזיק כמעט חצי שנה.</w:t>
             </w:r>
           </w:p>
         </w:tc>
@@ -4426,7 +4456,7 @@
                 <w:rtl/>
                 <w:rFonts w:ascii="Arial" w:cs="Arial" w:eastAsia="Arial" w:hAnsi="Arial"/>
               </w:rPr>
-              <w:t xml:space="preserve">שיער אחרי החלקה, צבע, הבהרה</w:t>
+              <w:t xml:space="preserve">שיער אחרי החלקה, צבע, הבהרה או פרמננט</w:t>
             </w:r>
           </w:p>
         </w:tc>
@@ -4529,7 +4559,7 @@
                 <w:rtl/>
                 <w:rFonts w:ascii="Arial" w:cs="Arial" w:eastAsia="Arial" w:hAnsi="Arial"/>
               </w:rPr>
-              <w:t xml:space="preserve">2 עד 5 דקות</w:t>
+              <w:t xml:space="preserve">2 עד 5 דקות, בלי חום</w:t>
             </w:r>
           </w:p>
         </w:tc>
@@ -4807,7 +4837,7 @@
                 <w:rtl/>
                 <w:rFonts w:ascii="Arial" w:cs="Arial" w:eastAsia="Arial" w:hAnsi="Arial"/>
               </w:rPr>
-              <w:t xml:space="preserve">כרטיס מחיר 1 - תווית</w:t>
+              <w:t xml:space="preserve">כרטיס מחיר 1</w:t>
             </w:r>
           </w:p>
         </w:tc>
@@ -4841,7 +4871,7 @@
                 <w:rtl/>
                 <w:rFonts w:ascii="Arial" w:cs="Arial" w:eastAsia="Arial" w:hAnsi="Arial"/>
               </w:rPr>
-              <w:t xml:space="preserve">קופסה אחת</w:t>
+              <w:t xml:space="preserve">קופסה אחת / 249 ₪ / 24 טיפולים · משלוח כלול</w:t>
             </w:r>
           </w:p>
         </w:tc>
@@ -4875,6 +4905,7 @@
                 <w:rtl/>
                 <w:rFonts w:ascii="Arial" w:cs="Arial" w:eastAsia="Arial" w:hAnsi="Arial"/>
               </w:rPr>
+              <w:t xml:space="preserve">תווית, מחיר, הערה.</w:t>
             </w:r>
           </w:p>
         </w:tc>
@@ -4910,7 +4941,7 @@
                 <w:rtl/>
                 <w:rFonts w:ascii="Arial" w:cs="Arial" w:eastAsia="Arial" w:hAnsi="Arial"/>
               </w:rPr>
-              <w:t xml:space="preserve">כרטיס מחיר 1 - מחיר</w:t>
+              <w:t xml:space="preserve">כרטיס מחיר 2</w:t>
             </w:r>
           </w:p>
         </w:tc>
@@ -4944,7 +4975,7 @@
                 <w:rtl/>
                 <w:rFonts w:ascii="Arial" w:cs="Arial" w:eastAsia="Arial" w:hAnsi="Arial"/>
               </w:rPr>
-              <w:t xml:space="preserve">249 ₪</w:t>
+              <w:t xml:space="preserve">הכי משתלם / 2 קופסאות / 419 ₪ / 48 טיפולים · חוסכים 79 ₪</w:t>
             </w:r>
           </w:p>
         </w:tc>
@@ -4978,524 +5009,7 @@
                 <w:rtl/>
                 <w:rFonts w:ascii="Arial" w:cs="Arial" w:eastAsia="Arial" w:hAnsi="Arial"/>
               </w:rPr>
-              <w:t xml:space="preserve">לא לשנות.</w:t>
-            </w:r>
-          </w:p>
-        </w:tc>
-      </w:tr>
-      <w:tr>
-        <w:tc>
-          <w:tcPr>
-            <w:tcW w:type="pct" w:w="22%"/>
-            <w:tcBorders>
-              <w:top w:val="single" w:color="D9D4C7" w:sz="4"/>
-              <w:left w:val="single" w:color="D9D4C7" w:sz="4"/>
-              <w:bottom w:val="single" w:color="D9D4C7" w:sz="4"/>
-              <w:right w:val="single" w:color="D9D4C7" w:sz="4"/>
-            </w:tcBorders>
-            <w:tcMar>
-              <w:top w:type="dxa" w:w="80"/>
-              <w:left w:type="dxa" w:w="120"/>
-              <w:bottom w:type="dxa" w:w="80"/>
-              <w:right w:type="dxa" w:w="120"/>
-            </w:tcMar>
-          </w:tcPr>
-          <w:p>
-            <w:pPr>
-              <w:bidi/>
-              <w:spacing w:before="0" w:after="0" w:line="300"/>
-              <w:jc w:val="right"/>
-            </w:pPr>
-            <w:r>
-              <w:rPr>
-                <w:color w:val="171512"/>
-                <w:sz w:val="21"/>
-                <w:szCs w:val="21"/>
-                <w:rtl/>
-                <w:rFonts w:ascii="Arial" w:cs="Arial" w:eastAsia="Arial" w:hAnsi="Arial"/>
-              </w:rPr>
-              <w:t xml:space="preserve">כרטיס מחיר 1 - הערה</w:t>
-            </w:r>
-          </w:p>
-        </w:tc>
-        <w:tc>
-          <w:tcPr>
-            <w:tcW w:type="pct" w:w="50%"/>
-            <w:tcBorders>
-              <w:top w:val="single" w:color="D9D4C7" w:sz="4"/>
-              <w:left w:val="single" w:color="D9D4C7" w:sz="4"/>
-              <w:bottom w:val="single" w:color="D9D4C7" w:sz="4"/>
-              <w:right w:val="single" w:color="D9D4C7" w:sz="4"/>
-            </w:tcBorders>
-            <w:tcMar>
-              <w:top w:type="dxa" w:w="80"/>
-              <w:left w:type="dxa" w:w="120"/>
-              <w:bottom w:type="dxa" w:w="80"/>
-              <w:right w:type="dxa" w:w="120"/>
-            </w:tcMar>
-          </w:tcPr>
-          <w:p>
-            <w:pPr>
-              <w:bidi/>
-              <w:spacing w:before="0" w:after="0" w:line="300"/>
-              <w:jc w:val="right"/>
-            </w:pPr>
-            <w:r>
-              <w:rPr>
-                <w:color w:val="171512"/>
-                <w:sz w:val="21"/>
-                <w:szCs w:val="21"/>
-                <w:rtl/>
-                <w:rFonts w:ascii="Arial" w:cs="Arial" w:eastAsia="Arial" w:hAnsi="Arial"/>
-              </w:rPr>
-              <w:t xml:space="preserve">24 טיפולים · משלוח כלול</w:t>
-            </w:r>
-          </w:p>
-        </w:tc>
-        <w:tc>
-          <w:tcPr>
-            <w:tcW w:type="pct" w:w="28%"/>
-            <w:tcBorders>
-              <w:top w:val="single" w:color="D9D4C7" w:sz="4"/>
-              <w:left w:val="single" w:color="D9D4C7" w:sz="4"/>
-              <w:bottom w:val="single" w:color="D9D4C7" w:sz="4"/>
-              <w:right w:val="single" w:color="D9D4C7" w:sz="4"/>
-            </w:tcBorders>
-            <w:tcMar>
-              <w:top w:type="dxa" w:w="80"/>
-              <w:left w:type="dxa" w:w="120"/>
-              <w:bottom w:type="dxa" w:w="80"/>
-              <w:right w:type="dxa" w:w="120"/>
-            </w:tcMar>
-          </w:tcPr>
-          <w:p>
-            <w:pPr>
-              <w:bidi/>
-              <w:spacing w:before="0" w:after="0" w:line="300"/>
-              <w:jc w:val="right"/>
-            </w:pPr>
-            <w:r>
-              <w:rPr>
-                <w:color w:val="171512"/>
-                <w:sz w:val="21"/>
-                <w:szCs w:val="21"/>
-                <w:rtl/>
-                <w:rFonts w:ascii="Arial" w:cs="Arial" w:eastAsia="Arial" w:hAnsi="Arial"/>
-              </w:rPr>
-            </w:r>
-          </w:p>
-        </w:tc>
-      </w:tr>
-      <w:tr>
-        <w:tc>
-          <w:tcPr>
-            <w:tcW w:type="pct" w:w="22%"/>
-            <w:tcBorders>
-              <w:top w:val="single" w:color="D9D4C7" w:sz="4"/>
-              <w:left w:val="single" w:color="D9D4C7" w:sz="4"/>
-              <w:bottom w:val="single" w:color="D9D4C7" w:sz="4"/>
-              <w:right w:val="single" w:color="D9D4C7" w:sz="4"/>
-            </w:tcBorders>
-            <w:tcMar>
-              <w:top w:type="dxa" w:w="80"/>
-              <w:left w:type="dxa" w:w="120"/>
-              <w:bottom w:type="dxa" w:w="80"/>
-              <w:right w:type="dxa" w:w="120"/>
-            </w:tcMar>
-          </w:tcPr>
-          <w:p>
-            <w:pPr>
-              <w:bidi/>
-              <w:spacing w:before="0" w:after="0" w:line="300"/>
-              <w:jc w:val="right"/>
-            </w:pPr>
-            <w:r>
-              <w:rPr>
-                <w:color w:val="171512"/>
-                <w:sz w:val="21"/>
-                <w:szCs w:val="21"/>
-                <w:rtl/>
-                <w:rFonts w:ascii="Arial" w:cs="Arial" w:eastAsia="Arial" w:hAnsi="Arial"/>
-              </w:rPr>
-              <w:t xml:space="preserve">כרטיס מחיר 2 - תג</w:t>
-            </w:r>
-          </w:p>
-        </w:tc>
-        <w:tc>
-          <w:tcPr>
-            <w:tcW w:type="pct" w:w="50%"/>
-            <w:tcBorders>
-              <w:top w:val="single" w:color="D9D4C7" w:sz="4"/>
-              <w:left w:val="single" w:color="D9D4C7" w:sz="4"/>
-              <w:bottom w:val="single" w:color="D9D4C7" w:sz="4"/>
-              <w:right w:val="single" w:color="D9D4C7" w:sz="4"/>
-            </w:tcBorders>
-            <w:tcMar>
-              <w:top w:type="dxa" w:w="80"/>
-              <w:left w:type="dxa" w:w="120"/>
-              <w:bottom w:type="dxa" w:w="80"/>
-              <w:right w:type="dxa" w:w="120"/>
-            </w:tcMar>
-          </w:tcPr>
-          <w:p>
-            <w:pPr>
-              <w:bidi/>
-              <w:spacing w:before="0" w:after="0" w:line="300"/>
-              <w:jc w:val="right"/>
-            </w:pPr>
-            <w:r>
-              <w:rPr>
-                <w:color w:val="171512"/>
-                <w:sz w:val="21"/>
-                <w:szCs w:val="21"/>
-                <w:rtl/>
-                <w:rFonts w:ascii="Arial" w:cs="Arial" w:eastAsia="Arial" w:hAnsi="Arial"/>
-              </w:rPr>
-              <w:t xml:space="preserve">המבצע</w:t>
-            </w:r>
-          </w:p>
-        </w:tc>
-        <w:tc>
-          <w:tcPr>
-            <w:tcW w:type="pct" w:w="28%"/>
-            <w:tcBorders>
-              <w:top w:val="single" w:color="D9D4C7" w:sz="4"/>
-              <w:left w:val="single" w:color="D9D4C7" w:sz="4"/>
-              <w:bottom w:val="single" w:color="D9D4C7" w:sz="4"/>
-              <w:right w:val="single" w:color="D9D4C7" w:sz="4"/>
-            </w:tcBorders>
-            <w:tcMar>
-              <w:top w:type="dxa" w:w="80"/>
-              <w:left w:type="dxa" w:w="120"/>
-              <w:bottom w:type="dxa" w:w="80"/>
-              <w:right w:type="dxa" w:w="120"/>
-            </w:tcMar>
-          </w:tcPr>
-          <w:p>
-            <w:pPr>
-              <w:bidi/>
-              <w:spacing w:before="0" w:after="0" w:line="300"/>
-              <w:jc w:val="right"/>
-            </w:pPr>
-            <w:r>
-              <w:rPr>
-                <w:color w:val="171512"/>
-                <w:sz w:val="21"/>
-                <w:szCs w:val="21"/>
-                <w:rtl/>
-                <w:rFonts w:ascii="Arial" w:cs="Arial" w:eastAsia="Arial" w:hAnsi="Arial"/>
-              </w:rPr>
-              <w:t xml:space="preserve">מילה אחת או שתיים.</w:t>
-            </w:r>
-          </w:p>
-        </w:tc>
-      </w:tr>
-      <w:tr>
-        <w:tc>
-          <w:tcPr>
-            <w:tcW w:type="pct" w:w="22%"/>
-            <w:tcBorders>
-              <w:top w:val="single" w:color="D9D4C7" w:sz="4"/>
-              <w:left w:val="single" w:color="D9D4C7" w:sz="4"/>
-              <w:bottom w:val="single" w:color="D9D4C7" w:sz="4"/>
-              <w:right w:val="single" w:color="D9D4C7" w:sz="4"/>
-            </w:tcBorders>
-            <w:tcMar>
-              <w:top w:type="dxa" w:w="80"/>
-              <w:left w:type="dxa" w:w="120"/>
-              <w:bottom w:type="dxa" w:w="80"/>
-              <w:right w:type="dxa" w:w="120"/>
-            </w:tcMar>
-          </w:tcPr>
-          <w:p>
-            <w:pPr>
-              <w:bidi/>
-              <w:spacing w:before="0" w:after="0" w:line="300"/>
-              <w:jc w:val="right"/>
-            </w:pPr>
-            <w:r>
-              <w:rPr>
-                <w:color w:val="171512"/>
-                <w:sz w:val="21"/>
-                <w:szCs w:val="21"/>
-                <w:rtl/>
-                <w:rFonts w:ascii="Arial" w:cs="Arial" w:eastAsia="Arial" w:hAnsi="Arial"/>
-              </w:rPr>
-              <w:t xml:space="preserve">כרטיס מחיר 2 - תווית</w:t>
-            </w:r>
-          </w:p>
-        </w:tc>
-        <w:tc>
-          <w:tcPr>
-            <w:tcW w:type="pct" w:w="50%"/>
-            <w:tcBorders>
-              <w:top w:val="single" w:color="D9D4C7" w:sz="4"/>
-              <w:left w:val="single" w:color="D9D4C7" w:sz="4"/>
-              <w:bottom w:val="single" w:color="D9D4C7" w:sz="4"/>
-              <w:right w:val="single" w:color="D9D4C7" w:sz="4"/>
-            </w:tcBorders>
-            <w:tcMar>
-              <w:top w:type="dxa" w:w="80"/>
-              <w:left w:type="dxa" w:w="120"/>
-              <w:bottom w:type="dxa" w:w="80"/>
-              <w:right w:type="dxa" w:w="120"/>
-            </w:tcMar>
-          </w:tcPr>
-          <w:p>
-            <w:pPr>
-              <w:bidi/>
-              <w:spacing w:before="0" w:after="0" w:line="300"/>
-              <w:jc w:val="right"/>
-            </w:pPr>
-            <w:r>
-              <w:rPr>
-                <w:color w:val="171512"/>
-                <w:sz w:val="21"/>
-                <w:szCs w:val="21"/>
-                <w:rtl/>
-                <w:rFonts w:ascii="Arial" w:cs="Arial" w:eastAsia="Arial" w:hAnsi="Arial"/>
-              </w:rPr>
-              <w:t xml:space="preserve">2 קופסאות</w:t>
-            </w:r>
-          </w:p>
-        </w:tc>
-        <w:tc>
-          <w:tcPr>
-            <w:tcW w:type="pct" w:w="28%"/>
-            <w:tcBorders>
-              <w:top w:val="single" w:color="D9D4C7" w:sz="4"/>
-              <w:left w:val="single" w:color="D9D4C7" w:sz="4"/>
-              <w:bottom w:val="single" w:color="D9D4C7" w:sz="4"/>
-              <w:right w:val="single" w:color="D9D4C7" w:sz="4"/>
-            </w:tcBorders>
-            <w:tcMar>
-              <w:top w:type="dxa" w:w="80"/>
-              <w:left w:type="dxa" w:w="120"/>
-              <w:bottom w:type="dxa" w:w="80"/>
-              <w:right w:type="dxa" w:w="120"/>
-            </w:tcMar>
-          </w:tcPr>
-          <w:p>
-            <w:pPr>
-              <w:bidi/>
-              <w:spacing w:before="0" w:after="0" w:line="300"/>
-              <w:jc w:val="right"/>
-            </w:pPr>
-            <w:r>
-              <w:rPr>
-                <w:color w:val="171512"/>
-                <w:sz w:val="21"/>
-                <w:szCs w:val="21"/>
-                <w:rtl/>
-                <w:rFonts w:ascii="Arial" w:cs="Arial" w:eastAsia="Arial" w:hAnsi="Arial"/>
-              </w:rPr>
-            </w:r>
-          </w:p>
-        </w:tc>
-      </w:tr>
-      <w:tr>
-        <w:tc>
-          <w:tcPr>
-            <w:tcW w:type="pct" w:w="22%"/>
-            <w:tcBorders>
-              <w:top w:val="single" w:color="D9D4C7" w:sz="4"/>
-              <w:left w:val="single" w:color="D9D4C7" w:sz="4"/>
-              <w:bottom w:val="single" w:color="D9D4C7" w:sz="4"/>
-              <w:right w:val="single" w:color="D9D4C7" w:sz="4"/>
-            </w:tcBorders>
-            <w:tcMar>
-              <w:top w:type="dxa" w:w="80"/>
-              <w:left w:type="dxa" w:w="120"/>
-              <w:bottom w:type="dxa" w:w="80"/>
-              <w:right w:type="dxa" w:w="120"/>
-            </w:tcMar>
-          </w:tcPr>
-          <w:p>
-            <w:pPr>
-              <w:bidi/>
-              <w:spacing w:before="0" w:after="0" w:line="300"/>
-              <w:jc w:val="right"/>
-            </w:pPr>
-            <w:r>
-              <w:rPr>
-                <w:color w:val="171512"/>
-                <w:sz w:val="21"/>
-                <w:szCs w:val="21"/>
-                <w:rtl/>
-                <w:rFonts w:ascii="Arial" w:cs="Arial" w:eastAsia="Arial" w:hAnsi="Arial"/>
-              </w:rPr>
-              <w:t xml:space="preserve">כרטיס מחיר 2 - מחיר</w:t>
-            </w:r>
-          </w:p>
-        </w:tc>
-        <w:tc>
-          <w:tcPr>
-            <w:tcW w:type="pct" w:w="50%"/>
-            <w:tcBorders>
-              <w:top w:val="single" w:color="D9D4C7" w:sz="4"/>
-              <w:left w:val="single" w:color="D9D4C7" w:sz="4"/>
-              <w:bottom w:val="single" w:color="D9D4C7" w:sz="4"/>
-              <w:right w:val="single" w:color="D9D4C7" w:sz="4"/>
-            </w:tcBorders>
-            <w:tcMar>
-              <w:top w:type="dxa" w:w="80"/>
-              <w:left w:type="dxa" w:w="120"/>
-              <w:bottom w:type="dxa" w:w="80"/>
-              <w:right w:type="dxa" w:w="120"/>
-            </w:tcMar>
-          </w:tcPr>
-          <w:p>
-            <w:pPr>
-              <w:bidi/>
-              <w:spacing w:before="0" w:after="0" w:line="300"/>
-              <w:jc w:val="right"/>
-            </w:pPr>
-            <w:r>
-              <w:rPr>
-                <w:color w:val="171512"/>
-                <w:sz w:val="21"/>
-                <w:szCs w:val="21"/>
-                <w:rtl/>
-                <w:rFonts w:ascii="Arial" w:cs="Arial" w:eastAsia="Arial" w:hAnsi="Arial"/>
-              </w:rPr>
-              <w:t xml:space="preserve">419 ₪</w:t>
-            </w:r>
-          </w:p>
-        </w:tc>
-        <w:tc>
-          <w:tcPr>
-            <w:tcW w:type="pct" w:w="28%"/>
-            <w:tcBorders>
-              <w:top w:val="single" w:color="D9D4C7" w:sz="4"/>
-              <w:left w:val="single" w:color="D9D4C7" w:sz="4"/>
-              <w:bottom w:val="single" w:color="D9D4C7" w:sz="4"/>
-              <w:right w:val="single" w:color="D9D4C7" w:sz="4"/>
-            </w:tcBorders>
-            <w:tcMar>
-              <w:top w:type="dxa" w:w="80"/>
-              <w:left w:type="dxa" w:w="120"/>
-              <w:bottom w:type="dxa" w:w="80"/>
-              <w:right w:type="dxa" w:w="120"/>
-            </w:tcMar>
-          </w:tcPr>
-          <w:p>
-            <w:pPr>
-              <w:bidi/>
-              <w:spacing w:before="0" w:after="0" w:line="300"/>
-              <w:jc w:val="right"/>
-            </w:pPr>
-            <w:r>
-              <w:rPr>
-                <w:color w:val="171512"/>
-                <w:sz w:val="21"/>
-                <w:szCs w:val="21"/>
-                <w:rtl/>
-                <w:rFonts w:ascii="Arial" w:cs="Arial" w:eastAsia="Arial" w:hAnsi="Arial"/>
-              </w:rPr>
-              <w:t xml:space="preserve">לא לשנות.</w:t>
-            </w:r>
-          </w:p>
-        </w:tc>
-      </w:tr>
-      <w:tr>
-        <w:tc>
-          <w:tcPr>
-            <w:tcW w:type="pct" w:w="22%"/>
-            <w:tcBorders>
-              <w:top w:val="single" w:color="D9D4C7" w:sz="4"/>
-              <w:left w:val="single" w:color="D9D4C7" w:sz="4"/>
-              <w:bottom w:val="single" w:color="D9D4C7" w:sz="4"/>
-              <w:right w:val="single" w:color="D9D4C7" w:sz="4"/>
-            </w:tcBorders>
-            <w:tcMar>
-              <w:top w:type="dxa" w:w="80"/>
-              <w:left w:type="dxa" w:w="120"/>
-              <w:bottom w:type="dxa" w:w="80"/>
-              <w:right w:type="dxa" w:w="120"/>
-            </w:tcMar>
-          </w:tcPr>
-          <w:p>
-            <w:pPr>
-              <w:bidi/>
-              <w:spacing w:before="0" w:after="0" w:line="300"/>
-              <w:jc w:val="right"/>
-            </w:pPr>
-            <w:r>
-              <w:rPr>
-                <w:color w:val="171512"/>
-                <w:sz w:val="21"/>
-                <w:szCs w:val="21"/>
-                <w:rtl/>
-                <w:rFonts w:ascii="Arial" w:cs="Arial" w:eastAsia="Arial" w:hAnsi="Arial"/>
-              </w:rPr>
-              <w:t xml:space="preserve">כרטיס מחיר 2 - הערה</w:t>
-            </w:r>
-          </w:p>
-        </w:tc>
-        <w:tc>
-          <w:tcPr>
-            <w:tcW w:type="pct" w:w="50%"/>
-            <w:tcBorders>
-              <w:top w:val="single" w:color="D9D4C7" w:sz="4"/>
-              <w:left w:val="single" w:color="D9D4C7" w:sz="4"/>
-              <w:bottom w:val="single" w:color="D9D4C7" w:sz="4"/>
-              <w:right w:val="single" w:color="D9D4C7" w:sz="4"/>
-            </w:tcBorders>
-            <w:tcMar>
-              <w:top w:type="dxa" w:w="80"/>
-              <w:left w:type="dxa" w:w="120"/>
-              <w:bottom w:type="dxa" w:w="80"/>
-              <w:right w:type="dxa" w:w="120"/>
-            </w:tcMar>
-          </w:tcPr>
-          <w:p>
-            <w:pPr>
-              <w:bidi/>
-              <w:spacing w:before="0" w:after="0" w:line="300"/>
-              <w:jc w:val="right"/>
-            </w:pPr>
-            <w:r>
-              <w:rPr>
-                <w:color w:val="171512"/>
-                <w:sz w:val="21"/>
-                <w:szCs w:val="21"/>
-                <w:rtl/>
-                <w:rFonts w:ascii="Arial" w:cs="Arial" w:eastAsia="Arial" w:hAnsi="Arial"/>
-              </w:rPr>
-              <w:t xml:space="preserve">48 טיפולים · חיסכון של 79 ₪</w:t>
-            </w:r>
-          </w:p>
-        </w:tc>
-        <w:tc>
-          <w:tcPr>
-            <w:tcW w:type="pct" w:w="28%"/>
-            <w:tcBorders>
-              <w:top w:val="single" w:color="D9D4C7" w:sz="4"/>
-              <w:left w:val="single" w:color="D9D4C7" w:sz="4"/>
-              <w:bottom w:val="single" w:color="D9D4C7" w:sz="4"/>
-              <w:right w:val="single" w:color="D9D4C7" w:sz="4"/>
-            </w:tcBorders>
-            <w:tcMar>
-              <w:top w:type="dxa" w:w="80"/>
-              <w:left w:type="dxa" w:w="120"/>
-              <w:bottom w:type="dxa" w:w="80"/>
-              <w:right w:type="dxa" w:w="120"/>
-            </w:tcMar>
-          </w:tcPr>
-          <w:p>
-            <w:pPr>
-              <w:bidi/>
-              <w:spacing w:before="0" w:after="0" w:line="300"/>
-              <w:jc w:val="right"/>
-            </w:pPr>
-            <w:r>
-              <w:rPr>
-                <w:color w:val="171512"/>
-                <w:sz w:val="21"/>
-                <w:szCs w:val="21"/>
-                <w:rtl/>
-                <w:rFonts w:ascii="Arial" w:cs="Arial" w:eastAsia="Arial" w:hAnsi="Arial"/>
-              </w:rPr>
+              <w:t xml:space="preserve">תג, תווית, מחיר, הערה.</w:t>
             </w:r>
           </w:p>
         </w:tc>
@@ -5821,7 +5335,7 @@
                 <w:rtl/>
                 <w:rFonts w:ascii="Arial" w:cs="Arial" w:eastAsia="Arial" w:hAnsi="Arial"/>
               </w:rPr>
-              <w:t xml:space="preserve">הטקסט הנוכחי באתר</w:t>
+              <w:t xml:space="preserve">הטקסט באתר</w:t>
             </w:r>
           </w:p>
         </w:tc>
@@ -5858,7 +5372,7 @@
                 <w:rtl/>
                 <w:rFonts w:ascii="Arial" w:cs="Arial" w:eastAsia="Arial" w:hAnsi="Arial"/>
               </w:rPr>
-              <w:t xml:space="preserve">הערות לקופירייטר</w:t>
+              <w:t xml:space="preserve">הערות ומגבלות</w:t>
             </w:r>
           </w:p>
         </w:tc>
@@ -6135,7 +5649,7 @@
                 <w:rtl/>
                 <w:rFonts w:ascii="Arial" w:cs="Arial" w:eastAsia="Arial" w:hAnsi="Arial"/>
               </w:rPr>
-              <w:t xml:space="preserve">החלקה, צבע והבהרה פותחים את הסיב ומרוקנים אותו. הטיפול נכנס פנימה ומאזן מחדש.</w:t>
+              <w:t xml:space="preserve">החלקה, צבע והבהרה פותחים את השערה ומרוקנים אותה מבפנים. הקרם נכנס פנימה וממלא בחזרה את מה שאבד.</w:t>
             </w:r>
           </w:p>
         </w:tc>
@@ -6239,7 +5753,7 @@
                 <w:rtl/>
                 <w:rFonts w:ascii="Arial" w:cs="Arial" w:eastAsia="Arial" w:hAnsi="Arial"/>
               </w:rPr>
-              <w:t xml:space="preserve">חודר לעומק הסיב</w:t>
+              <w:t xml:space="preserve">נכנס פנימה, לא רק מצפה</w:t>
             </w:r>
           </w:p>
         </w:tc>
@@ -6343,7 +5857,7 @@
                 <w:rtl/>
                 <w:rFonts w:ascii="Arial" w:cs="Arial" w:eastAsia="Arial" w:hAnsi="Arial"/>
               </w:rPr>
-              <w:t xml:space="preserve">נוסחה שמיועדת לשיער אחרי טיפול כימי: לא רק מצפה מבחוץ, אלא נכנסת פנימה ומחזירה גמישות.</w:t>
+              <w:t xml:space="preserve">רוב המסכות עוטפות את השערה מבחוץ ונשטפות בשטיפה הבאה. הקרם הזה נכנס לתוך הסיב, לשם שהנזק נמצא, ומחזיר גמישות.</w:t>
             </w:r>
           </w:p>
         </w:tc>
@@ -6550,7 +6064,7 @@
                 <w:rtl/>
                 <w:rFonts w:ascii="Arial" w:cs="Arial" w:eastAsia="Arial" w:hAnsi="Arial"/>
               </w:rPr>
-              <w:t xml:space="preserve">קרטין ממלא את מה שנשחק, תמצית משי ושמן חמניות מוסיפים ברק והחלקה שמרגישים ביד.</w:t>
+              <w:t xml:space="preserve">הקרטין ממלא את מה שנשחק, והמשי ושמן החמניות נותנים ברק והחלקה שמרגישים כבר ביד.</w:t>
             </w:r>
           </w:p>
         </w:tc>
@@ -6756,7 +6270,7 @@
                 <w:rtl/>
                 <w:rFonts w:ascii="Arial" w:cs="Arial" w:eastAsia="Arial" w:hAnsi="Arial"/>
               </w:rPr>
-              <w:t xml:space="preserve">לא צריך מכשיר, לא צריך מספרה. חופפים, מורחים, ממתינים כמה דקות, שוטפים.</w:t>
+              <w:t xml:space="preserve">בלי מכשיר ובלי תור למספרה. חופפים, מורחים, מחכים כמה דקות ושוטפים.</w:t>
             </w:r>
           </w:p>
         </w:tc>
@@ -6962,7 +6476,7 @@
                 <w:rtl/>
                 <w:rFonts w:ascii="Arial" w:cs="Arial" w:eastAsia="Arial" w:hAnsi="Arial"/>
               </w:rPr>
-              <w:t xml:space="preserve">30 מ״ל בכל שקית, המידה הנכונה לטיפול אחד. 24 שקיות בקופסה, בלי לנחש ובלי לבזבז.</w:t>
+              <w:t xml:space="preserve">30 מ״ל בשקית, בדיוק הכמות לטיפול אחד. 24 שקיות בקופסה, בלי לנחש ובלי לבזבז.</w:t>
             </w:r>
           </w:p>
         </w:tc>
@@ -7113,7 +6627,7 @@
                 <w:rtl/>
                 <w:rFonts w:ascii="Arial" w:cs="Arial" w:eastAsia="Arial" w:hAnsi="Arial"/>
               </w:rPr>
-              <w:t xml:space="preserve">הטקסט הנוכחי באתר</w:t>
+              <w:t xml:space="preserve">הטקסט באתר</w:t>
             </w:r>
           </w:p>
         </w:tc>
@@ -7150,7 +6664,7 @@
                 <w:rtl/>
                 <w:rFonts w:ascii="Arial" w:cs="Arial" w:eastAsia="Arial" w:hAnsi="Arial"/>
               </w:rPr>
-              <w:t xml:space="preserve">הערות לקופירייטר</w:t>
+              <w:t xml:space="preserve">הערות ומגבלות</w:t>
             </w:r>
           </w:p>
         </w:tc>
@@ -7323,7 +6837,7 @@
                 <w:rtl/>
                 <w:rFonts w:ascii="Arial" w:cs="Arial" w:eastAsia="Arial" w:hAnsi="Arial"/>
               </w:rPr>
-              <w:t xml:space="preserve">ארבעה צעדים</w:t>
+              <w:t xml:space="preserve">חופפים, מורחים, שוטפים</w:t>
             </w:r>
           </w:p>
         </w:tc>
@@ -7357,6 +6871,7 @@
                 <w:rtl/>
                 <w:rFonts w:ascii="Arial" w:cs="Arial" w:eastAsia="Arial" w:hAnsi="Arial"/>
               </w:rPr>
+              <w:t xml:space="preserve">הכותרת מספרת את כל התהליך בשלוש מילים.</w:t>
             </w:r>
           </w:p>
         </w:tc>
@@ -7530,7 +7045,7 @@
                 <w:rtl/>
                 <w:rFonts w:ascii="Arial" w:cs="Arial" w:eastAsia="Arial" w:hAnsi="Arial"/>
               </w:rPr>
-              <w:t xml:space="preserve">שמפו רגיל, ומסירים את רוב המים במגבת. השיער צריך להיות לח, לא נוטף.</w:t>
+              <w:t xml:space="preserve">שמפו רגיל, ומנגבים קצת עם מגבת. השיער צריך להיות לח, לא נוטף.</w:t>
             </w:r>
           </w:p>
         </w:tc>
@@ -7736,7 +7251,7 @@
                 <w:rtl/>
                 <w:rFonts w:ascii="Arial" w:cs="Arial" w:eastAsia="Arial" w:hAnsi="Arial"/>
               </w:rPr>
-              <w:t xml:space="preserve">מהאמצע עד הקצוות, ומעסים בעדינות כך שכל שערה מכוסה.</w:t>
+              <w:t xml:space="preserve">מהאמצע עד הקצוות, ומעסים בעדינות עד שכל שערה מכוסה.</w:t>
             </w:r>
           </w:p>
         </w:tc>
@@ -7839,7 +7354,7 @@
                 <w:rtl/>
                 <w:rFonts w:ascii="Arial" w:cs="Arial" w:eastAsia="Arial" w:hAnsi="Arial"/>
               </w:rPr>
-              <w:t xml:space="preserve">ממתינים 2 עד 5 דקות</w:t>
+              <w:t xml:space="preserve">מחכים 2 עד 5 דקות</w:t>
             </w:r>
           </w:p>
         </w:tc>
@@ -7942,7 +7457,7 @@
                 <w:rtl/>
                 <w:rFonts w:ascii="Arial" w:cs="Arial" w:eastAsia="Arial" w:hAnsi="Arial"/>
               </w:rPr>
-              <w:t xml:space="preserve">בלי כיסוי, בלי חום. הקרם עובד לבד.</w:t>
+              <w:t xml:space="preserve">בלי כיסוי ובלי חום. הקרם עושה את העבודה לבד.</w:t>
             </w:r>
           </w:p>
         </w:tc>
@@ -8045,7 +7560,7 @@
                 <w:rtl/>
                 <w:rFonts w:ascii="Arial" w:cs="Arial" w:eastAsia="Arial" w:hAnsi="Arial"/>
               </w:rPr>
-              <w:t xml:space="preserve">שוטפים במים נקיים</w:t>
+              <w:t xml:space="preserve">שוטפים היטב</w:t>
             </w:r>
           </w:p>
         </w:tc>
@@ -8148,7 +7663,7 @@
                 <w:rtl/>
                 <w:rFonts w:ascii="Arial" w:cs="Arial" w:eastAsia="Arial" w:hAnsi="Arial"/>
               </w:rPr>
-              <w:t xml:space="preserve">עד שהמים יוצאים צלולים. מייבשים כרגיל ומרגישים את ההבדל.</w:t>
+              <w:t xml:space="preserve">עד שהמים יוצאים נקיים. מייבשים כרגיל, וההבדל מורגש כבר ביד.</w:t>
             </w:r>
           </w:p>
         </w:tc>
@@ -8251,7 +7766,7 @@
                 <w:rtl/>
                 <w:rFonts w:ascii="Arial" w:cs="Arial" w:eastAsia="Arial" w:hAnsi="Arial"/>
               </w:rPr>
-              <w:t xml:space="preserve">טיפ: אחרי החלקה או צבע, טיפול פעם בשבוע שומר על התוצאה לאורך זמן.</w:t>
+              <w:t xml:space="preserve">טיפ: טיפול פעם בשבוע אחרי החלקה או צבע, וההשקעה מהמספרה מחזיקה הרבה יותר זמן.</w:t>
             </w:r>
           </w:p>
         </w:tc>
@@ -8412,6 +7927,25 @@
           <w:rFonts w:ascii="Arial" w:cs="Arial" w:eastAsia="Arial" w:hAnsi="Arial"/>
         </w:rPr>
         <w:t xml:space="preserve">1.8 שאלות ותשובות</w:t>
+      </w:r>
+    </w:p>
+    <w:p>
+      <w:pPr>
+        <w:bidi/>
+        <w:spacing w:before="60" w:after="120" w:line="300"/>
+        <w:jc w:val="right"/>
+      </w:pPr>
+      <w:r>
+        <w:rPr>
+          <w:i/>
+          <w:iCs/>
+          <w:color w:val="6B6560"/>
+          <w:sz w:val="19"/>
+          <w:szCs w:val="19"/>
+          <w:rtl/>
+          <w:rFonts w:ascii="Arial" w:cs="Arial" w:eastAsia="Arial" w:hAnsi="Arial"/>
+        </w:rPr>
+        <w:t xml:space="preserve">זה לא אזור מידע אלא אזור של טיפול בהתנגדויות. כל שאלה היא ספק אמיתי שעוצר הזמנה. שתי השאלות הראשונות נוספו במעבר הקופי.</w:t>
       </w:r>
     </w:p>
     <w:tbl>
@@ -8506,7 +8040,7 @@
                 <w:rtl/>
                 <w:rFonts w:ascii="Arial" w:cs="Arial" w:eastAsia="Arial" w:hAnsi="Arial"/>
               </w:rPr>
-              <w:t xml:space="preserve">הטקסט הנוכחי באתר</w:t>
+              <w:t xml:space="preserve">הטקסט באתר</w:t>
             </w:r>
           </w:p>
         </w:tc>
@@ -8543,7 +8077,7 @@
                 <w:rtl/>
                 <w:rFonts w:ascii="Arial" w:cs="Arial" w:eastAsia="Arial" w:hAnsi="Arial"/>
               </w:rPr>
-              <w:t xml:space="preserve">הערות לקופירייטר</w:t>
+              <w:t xml:space="preserve">הערות ומגבלות</w:t>
             </w:r>
           </w:p>
         </w:tc>
@@ -8716,7 +8250,7 @@
                 <w:rtl/>
                 <w:rFonts w:ascii="Arial" w:cs="Arial" w:eastAsia="Arial" w:hAnsi="Arial"/>
               </w:rPr>
-              <w:t xml:space="preserve">מה שרוצים לדעת</w:t>
+              <w:t xml:space="preserve">מה שרוצים לדעת לפני שמזמינים</w:t>
             </w:r>
           </w:p>
         </w:tc>
@@ -8785,7 +8319,7 @@
                 <w:rtl/>
                 <w:rFonts w:ascii="Arial" w:cs="Arial" w:eastAsia="Arial" w:hAnsi="Arial"/>
               </w:rPr>
-              <w:t xml:space="preserve">שאלה 1</w:t>
+              <w:t xml:space="preserve">שאלה 1 (חדשה)</w:t>
             </w:r>
           </w:p>
         </w:tc>
@@ -8819,7 +8353,7 @@
                 <w:rtl/>
                 <w:rFonts w:ascii="Arial" w:cs="Arial" w:eastAsia="Arial" w:hAnsi="Arial"/>
               </w:rPr>
-              <w:t xml:space="preserve">למי הטיפול מתאים?</w:t>
+              <w:t xml:space="preserve">ניסיתי מסכות ולא ראיתי שינוי. למה שזה יהיה אחרת?</w:t>
             </w:r>
           </w:p>
         </w:tc>
@@ -8853,6 +8387,7 @@
                 <w:rtl/>
                 <w:rFonts w:ascii="Arial" w:cs="Arial" w:eastAsia="Arial" w:hAnsi="Arial"/>
               </w:rPr>
+              <w:t xml:space="preserve">ההתנגדות הכי גדולה. לכן ראשונה.</w:t>
             </w:r>
           </w:p>
         </w:tc>
@@ -8922,7 +8457,7 @@
                 <w:rtl/>
                 <w:rFonts w:ascii="Arial" w:cs="Arial" w:eastAsia="Arial" w:hAnsi="Arial"/>
               </w:rPr>
-              <w:t xml:space="preserve">לכל מי שהשיער שלו עבר החלקה, צבע, הבהרה או פרמננט ומרגיש יבש, מחוספס או חסר ברק. מתאים גם לשיער בריא כטיפול שבועי.</w:t>
+              <w:t xml:space="preserve">רוב המסכות בסופר מצפות את השערה מבחוץ, ובשטיפה הבאה זה כבר לא שם. Green Bio מיועד לשיער שעבר טיפול כימי: הוא נכנס לתוך הסיב שנפתח בהחלקה או בצבע וממלא אותו בחזרה. ההבדל הראשון שמרגישים הוא ביד, כשהיד עוברת בשיער בלי להיתקע.</w:t>
             </w:r>
           </w:p>
         </w:tc>
@@ -8956,6 +8491,7 @@
                 <w:rtl/>
                 <w:rFonts w:ascii="Arial" w:cs="Arial" w:eastAsia="Arial" w:hAnsi="Arial"/>
               </w:rPr>
+              <w:t xml:space="preserve">בלי הבטחת תוצאה, רק תיאור של מה שקורה.</w:t>
             </w:r>
           </w:p>
         </w:tc>
@@ -8991,7 +8527,7 @@
                 <w:rtl/>
                 <w:rFonts w:ascii="Arial" w:cs="Arial" w:eastAsia="Arial" w:hAnsi="Arial"/>
               </w:rPr>
-              <w:t xml:space="preserve">שאלה 2</w:t>
+              <w:t xml:space="preserve">שאלה 2 (חדשה)</w:t>
             </w:r>
           </w:p>
         </w:tc>
@@ -9025,7 +8561,7 @@
                 <w:rtl/>
                 <w:rFonts w:ascii="Arial" w:cs="Arial" w:eastAsia="Arial" w:hAnsi="Arial"/>
               </w:rPr>
-              <w:t xml:space="preserve">כמה זמן מספיקה קופסה?</w:t>
+              <w:t xml:space="preserve">זה בטוח לשיער צבוע או מוחלק?</w:t>
             </w:r>
           </w:p>
         </w:tc>
@@ -9128,7 +8664,7 @@
                 <w:rtl/>
                 <w:rFonts w:ascii="Arial" w:cs="Arial" w:eastAsia="Arial" w:hAnsi="Arial"/>
               </w:rPr>
-              <w:t xml:space="preserve">24 שקיות. בטיפול אחד בשבוע זה כחצי שנה. בשיער ארוך במיוחד לפעמים משתמשים בשקית וחצי.</w:t>
+              <w:t xml:space="preserve">כן, זה בדיוק הייעוד שלו. על האריזה כתוב Use After Chemical Treat, כלומר לשימוש אחרי טיפול כימי. אין ברשימת הרכיבים חומר מחמצן או צבע, אז הוא לא משנה את הגוון.</w:t>
             </w:r>
           </w:p>
         </w:tc>
@@ -9162,6 +8698,7 @@
                 <w:rtl/>
                 <w:rFonts w:ascii="Arial" w:cs="Arial" w:eastAsia="Arial" w:hAnsi="Arial"/>
               </w:rPr>
+              <w:t xml:space="preserve">עובדה מהאריזה. לא לשנות את הטענה.</w:t>
             </w:r>
           </w:p>
         </w:tc>
@@ -9231,7 +8768,7 @@
                 <w:rtl/>
                 <w:rFonts w:ascii="Arial" w:cs="Arial" w:eastAsia="Arial" w:hAnsi="Arial"/>
               </w:rPr>
-              <w:t xml:space="preserve">צריך חום או אדים?</w:t>
+              <w:t xml:space="preserve">למי הטיפול מתאים?</w:t>
             </w:r>
           </w:p>
         </w:tc>
@@ -9334,7 +8871,7 @@
                 <w:rtl/>
                 <w:rFonts w:ascii="Arial" w:cs="Arial" w:eastAsia="Arial" w:hAnsi="Arial"/>
               </w:rPr>
-              <w:t xml:space="preserve">לא. הנוסחה מיועדת לעבוד בטמפרטורת החדר. 2 עד 5 דקות ושוטפים.</w:t>
+              <w:t xml:space="preserve">לכל שיער שעבר החלקה, צבע, הבהרה או פרמננט ומרגיש יבש, מחוספס או בלי ברק. עובד יפה גם על שיער בריא, כטיפול שבועי.</w:t>
             </w:r>
           </w:p>
         </w:tc>
@@ -9437,7 +8974,7 @@
                 <w:rtl/>
                 <w:rFonts w:ascii="Arial" w:cs="Arial" w:eastAsia="Arial" w:hAnsi="Arial"/>
               </w:rPr>
-              <w:t xml:space="preserve">איך משלמים ומה עם המשלוח?</w:t>
+              <w:t xml:space="preserve">כמה זמן מספיקה קופסה?</w:t>
             </w:r>
           </w:p>
         </w:tc>
@@ -9540,7 +9077,7 @@
                 <w:rtl/>
                 <w:rFonts w:ascii="Arial" w:cs="Arial" w:eastAsia="Arial" w:hAnsi="Arial"/>
               </w:rPr>
-              <w:t xml:space="preserve">ממלאים את טופס ההזמנה, אנחנו חוזרים אליכם לאישור ולתיאום תשלום (ביט, פייבוקס או מזומן במשלוח). המשלוח כלול במחיר.</w:t>
+              <w:t xml:space="preserve">יש בקופסה 24 שקיות. בטיפול פעם בשבוע זה כמעט חצי שנה. לשיער ארוך במיוחד הולכת לפעמים שקית וחצי.</w:t>
             </w:r>
           </w:p>
         </w:tc>
@@ -9574,7 +9111,6 @@
                 <w:rtl/>
                 <w:rFonts w:ascii="Arial" w:cs="Arial" w:eastAsia="Arial" w:hAnsi="Arial"/>
               </w:rPr>
-              <w:t xml:space="preserve">לא להבטיח משלוח עד הבית. שיטת המשלוח תאושר על ידי איציק.</w:t>
             </w:r>
           </w:p>
         </w:tc>
@@ -9644,7 +9180,7 @@
                 <w:rtl/>
                 <w:rFonts w:ascii="Arial" w:cs="Arial" w:eastAsia="Arial" w:hAnsi="Arial"/>
               </w:rPr>
-              <w:t xml:space="preserve">מה יש בפנים?</w:t>
+              <w:t xml:space="preserve">צריך חום או אדים?</w:t>
             </w:r>
           </w:p>
         </w:tc>
@@ -9747,6 +9283,419 @@
                 <w:rtl/>
                 <w:rFonts w:ascii="Arial" w:cs="Arial" w:eastAsia="Arial" w:hAnsi="Arial"/>
               </w:rPr>
+              <w:t xml:space="preserve">לא. הקרם עובד בטמפרטורת החדר: מורחים, מחכים 2 עד 5 דקות ושוטפים.</w:t>
+            </w:r>
+          </w:p>
+        </w:tc>
+        <w:tc>
+          <w:tcPr>
+            <w:tcW w:type="pct" w:w="28%"/>
+            <w:tcBorders>
+              <w:top w:val="single" w:color="D9D4C7" w:sz="4"/>
+              <w:left w:val="single" w:color="D9D4C7" w:sz="4"/>
+              <w:bottom w:val="single" w:color="D9D4C7" w:sz="4"/>
+              <w:right w:val="single" w:color="D9D4C7" w:sz="4"/>
+            </w:tcBorders>
+            <w:tcMar>
+              <w:top w:type="dxa" w:w="80"/>
+              <w:left w:type="dxa" w:w="120"/>
+              <w:bottom w:type="dxa" w:w="80"/>
+              <w:right w:type="dxa" w:w="120"/>
+            </w:tcMar>
+          </w:tcPr>
+          <w:p>
+            <w:pPr>
+              <w:bidi/>
+              <w:spacing w:before="0" w:after="0" w:line="300"/>
+              <w:jc w:val="right"/>
+            </w:pPr>
+            <w:r>
+              <w:rPr>
+                <w:color w:val="171512"/>
+                <w:sz w:val="21"/>
+                <w:szCs w:val="21"/>
+                <w:rtl/>
+                <w:rFonts w:ascii="Arial" w:cs="Arial" w:eastAsia="Arial" w:hAnsi="Arial"/>
+              </w:rPr>
+            </w:r>
+          </w:p>
+        </w:tc>
+      </w:tr>
+      <w:tr>
+        <w:tc>
+          <w:tcPr>
+            <w:tcW w:type="pct" w:w="22%"/>
+            <w:tcBorders>
+              <w:top w:val="single" w:color="D9D4C7" w:sz="4"/>
+              <w:left w:val="single" w:color="D9D4C7" w:sz="4"/>
+              <w:bottom w:val="single" w:color="D9D4C7" w:sz="4"/>
+              <w:right w:val="single" w:color="D9D4C7" w:sz="4"/>
+            </w:tcBorders>
+            <w:tcMar>
+              <w:top w:type="dxa" w:w="80"/>
+              <w:left w:type="dxa" w:w="120"/>
+              <w:bottom w:type="dxa" w:w="80"/>
+              <w:right w:type="dxa" w:w="120"/>
+            </w:tcMar>
+          </w:tcPr>
+          <w:p>
+            <w:pPr>
+              <w:bidi/>
+              <w:spacing w:before="0" w:after="0" w:line="300"/>
+              <w:jc w:val="right"/>
+            </w:pPr>
+            <w:r>
+              <w:rPr>
+                <w:color w:val="171512"/>
+                <w:sz w:val="21"/>
+                <w:szCs w:val="21"/>
+                <w:rtl/>
+                <w:rFonts w:ascii="Arial" w:cs="Arial" w:eastAsia="Arial" w:hAnsi="Arial"/>
+              </w:rPr>
+              <w:t xml:space="preserve">שאלה 6</w:t>
+            </w:r>
+          </w:p>
+        </w:tc>
+        <w:tc>
+          <w:tcPr>
+            <w:tcW w:type="pct" w:w="50%"/>
+            <w:tcBorders>
+              <w:top w:val="single" w:color="D9D4C7" w:sz="4"/>
+              <w:left w:val="single" w:color="D9D4C7" w:sz="4"/>
+              <w:bottom w:val="single" w:color="D9D4C7" w:sz="4"/>
+              <w:right w:val="single" w:color="D9D4C7" w:sz="4"/>
+            </w:tcBorders>
+            <w:tcMar>
+              <w:top w:type="dxa" w:w="80"/>
+              <w:left w:type="dxa" w:w="120"/>
+              <w:bottom w:type="dxa" w:w="80"/>
+              <w:right w:type="dxa" w:w="120"/>
+            </w:tcMar>
+          </w:tcPr>
+          <w:p>
+            <w:pPr>
+              <w:bidi/>
+              <w:spacing w:before="0" w:after="0" w:line="300"/>
+              <w:jc w:val="right"/>
+            </w:pPr>
+            <w:r>
+              <w:rPr>
+                <w:color w:val="171512"/>
+                <w:sz w:val="21"/>
+                <w:szCs w:val="21"/>
+                <w:rtl/>
+                <w:rFonts w:ascii="Arial" w:cs="Arial" w:eastAsia="Arial" w:hAnsi="Arial"/>
+              </w:rPr>
+              <w:t xml:space="preserve">איך משלמים ומה עם המשלוח?</w:t>
+            </w:r>
+          </w:p>
+        </w:tc>
+        <w:tc>
+          <w:tcPr>
+            <w:tcW w:type="pct" w:w="28%"/>
+            <w:tcBorders>
+              <w:top w:val="single" w:color="D9D4C7" w:sz="4"/>
+              <w:left w:val="single" w:color="D9D4C7" w:sz="4"/>
+              <w:bottom w:val="single" w:color="D9D4C7" w:sz="4"/>
+              <w:right w:val="single" w:color="D9D4C7" w:sz="4"/>
+            </w:tcBorders>
+            <w:tcMar>
+              <w:top w:type="dxa" w:w="80"/>
+              <w:left w:type="dxa" w:w="120"/>
+              <w:bottom w:type="dxa" w:w="80"/>
+              <w:right w:type="dxa" w:w="120"/>
+            </w:tcMar>
+          </w:tcPr>
+          <w:p>
+            <w:pPr>
+              <w:bidi/>
+              <w:spacing w:before="0" w:after="0" w:line="300"/>
+              <w:jc w:val="right"/>
+            </w:pPr>
+            <w:r>
+              <w:rPr>
+                <w:color w:val="171512"/>
+                <w:sz w:val="21"/>
+                <w:szCs w:val="21"/>
+                <w:rtl/>
+                <w:rFonts w:ascii="Arial" w:cs="Arial" w:eastAsia="Arial" w:hAnsi="Arial"/>
+              </w:rPr>
+            </w:r>
+          </w:p>
+        </w:tc>
+      </w:tr>
+      <w:tr>
+        <w:tc>
+          <w:tcPr>
+            <w:tcW w:type="pct" w:w="22%"/>
+            <w:tcBorders>
+              <w:top w:val="single" w:color="D9D4C7" w:sz="4"/>
+              <w:left w:val="single" w:color="D9D4C7" w:sz="4"/>
+              <w:bottom w:val="single" w:color="D9D4C7" w:sz="4"/>
+              <w:right w:val="single" w:color="D9D4C7" w:sz="4"/>
+            </w:tcBorders>
+            <w:tcMar>
+              <w:top w:type="dxa" w:w="80"/>
+              <w:left w:type="dxa" w:w="120"/>
+              <w:bottom w:type="dxa" w:w="80"/>
+              <w:right w:type="dxa" w:w="120"/>
+            </w:tcMar>
+          </w:tcPr>
+          <w:p>
+            <w:pPr>
+              <w:bidi/>
+              <w:spacing w:before="0" w:after="0" w:line="300"/>
+              <w:jc w:val="right"/>
+            </w:pPr>
+            <w:r>
+              <w:rPr>
+                <w:color w:val="171512"/>
+                <w:sz w:val="21"/>
+                <w:szCs w:val="21"/>
+                <w:rtl/>
+                <w:rFonts w:ascii="Arial" w:cs="Arial" w:eastAsia="Arial" w:hAnsi="Arial"/>
+              </w:rPr>
+              <w:t xml:space="preserve">תשובה 6</w:t>
+            </w:r>
+          </w:p>
+        </w:tc>
+        <w:tc>
+          <w:tcPr>
+            <w:tcW w:type="pct" w:w="50%"/>
+            <w:tcBorders>
+              <w:top w:val="single" w:color="D9D4C7" w:sz="4"/>
+              <w:left w:val="single" w:color="D9D4C7" w:sz="4"/>
+              <w:bottom w:val="single" w:color="D9D4C7" w:sz="4"/>
+              <w:right w:val="single" w:color="D9D4C7" w:sz="4"/>
+            </w:tcBorders>
+            <w:tcMar>
+              <w:top w:type="dxa" w:w="80"/>
+              <w:left w:type="dxa" w:w="120"/>
+              <w:bottom w:type="dxa" w:w="80"/>
+              <w:right w:type="dxa" w:w="120"/>
+            </w:tcMar>
+          </w:tcPr>
+          <w:p>
+            <w:pPr>
+              <w:bidi/>
+              <w:spacing w:before="0" w:after="0" w:line="300"/>
+              <w:jc w:val="right"/>
+            </w:pPr>
+            <w:r>
+              <w:rPr>
+                <w:color w:val="171512"/>
+                <w:sz w:val="21"/>
+                <w:szCs w:val="21"/>
+                <w:rtl/>
+                <w:rFonts w:ascii="Arial" w:cs="Arial" w:eastAsia="Arial" w:hAnsi="Arial"/>
+              </w:rPr>
+              <w:t xml:space="preserve">באתר לא משלמים כלום. ממלאים את הטופס, אנחנו מתקשרים לאשר, ורק אז מתאמים תשלום: ביט, פייבוקס או מזומן. המשלוח כלול במחיר.</w:t>
+            </w:r>
+          </w:p>
+        </w:tc>
+        <w:tc>
+          <w:tcPr>
+            <w:tcW w:type="pct" w:w="28%"/>
+            <w:tcBorders>
+              <w:top w:val="single" w:color="D9D4C7" w:sz="4"/>
+              <w:left w:val="single" w:color="D9D4C7" w:sz="4"/>
+              <w:bottom w:val="single" w:color="D9D4C7" w:sz="4"/>
+              <w:right w:val="single" w:color="D9D4C7" w:sz="4"/>
+            </w:tcBorders>
+            <w:tcMar>
+              <w:top w:type="dxa" w:w="80"/>
+              <w:left w:type="dxa" w:w="120"/>
+              <w:bottom w:type="dxa" w:w="80"/>
+              <w:right w:type="dxa" w:w="120"/>
+            </w:tcMar>
+          </w:tcPr>
+          <w:p>
+            <w:pPr>
+              <w:bidi/>
+              <w:spacing w:before="0" w:after="0" w:line="300"/>
+              <w:jc w:val="right"/>
+            </w:pPr>
+            <w:r>
+              <w:rPr>
+                <w:color w:val="171512"/>
+                <w:sz w:val="21"/>
+                <w:szCs w:val="21"/>
+                <w:rtl/>
+                <w:rFonts w:ascii="Arial" w:cs="Arial" w:eastAsia="Arial" w:hAnsi="Arial"/>
+              </w:rPr>
+              <w:t xml:space="preserve">לא להבטיח משלוח עד הבית עד שתיסגר שיטת המשלוח.</w:t>
+            </w:r>
+          </w:p>
+        </w:tc>
+      </w:tr>
+      <w:tr>
+        <w:tc>
+          <w:tcPr>
+            <w:tcW w:type="pct" w:w="22%"/>
+            <w:tcBorders>
+              <w:top w:val="single" w:color="D9D4C7" w:sz="4"/>
+              <w:left w:val="single" w:color="D9D4C7" w:sz="4"/>
+              <w:bottom w:val="single" w:color="D9D4C7" w:sz="4"/>
+              <w:right w:val="single" w:color="D9D4C7" w:sz="4"/>
+            </w:tcBorders>
+            <w:tcMar>
+              <w:top w:type="dxa" w:w="80"/>
+              <w:left w:type="dxa" w:w="120"/>
+              <w:bottom w:type="dxa" w:w="80"/>
+              <w:right w:type="dxa" w:w="120"/>
+            </w:tcMar>
+          </w:tcPr>
+          <w:p>
+            <w:pPr>
+              <w:bidi/>
+              <w:spacing w:before="0" w:after="0" w:line="300"/>
+              <w:jc w:val="right"/>
+            </w:pPr>
+            <w:r>
+              <w:rPr>
+                <w:color w:val="171512"/>
+                <w:sz w:val="21"/>
+                <w:szCs w:val="21"/>
+                <w:rtl/>
+                <w:rFonts w:ascii="Arial" w:cs="Arial" w:eastAsia="Arial" w:hAnsi="Arial"/>
+              </w:rPr>
+              <w:t xml:space="preserve">שאלה 7</w:t>
+            </w:r>
+          </w:p>
+        </w:tc>
+        <w:tc>
+          <w:tcPr>
+            <w:tcW w:type="pct" w:w="50%"/>
+            <w:tcBorders>
+              <w:top w:val="single" w:color="D9D4C7" w:sz="4"/>
+              <w:left w:val="single" w:color="D9D4C7" w:sz="4"/>
+              <w:bottom w:val="single" w:color="D9D4C7" w:sz="4"/>
+              <w:right w:val="single" w:color="D9D4C7" w:sz="4"/>
+            </w:tcBorders>
+            <w:tcMar>
+              <w:top w:type="dxa" w:w="80"/>
+              <w:left w:type="dxa" w:w="120"/>
+              <w:bottom w:type="dxa" w:w="80"/>
+              <w:right w:type="dxa" w:w="120"/>
+            </w:tcMar>
+          </w:tcPr>
+          <w:p>
+            <w:pPr>
+              <w:bidi/>
+              <w:spacing w:before="0" w:after="0" w:line="300"/>
+              <w:jc w:val="right"/>
+            </w:pPr>
+            <w:r>
+              <w:rPr>
+                <w:color w:val="171512"/>
+                <w:sz w:val="21"/>
+                <w:szCs w:val="21"/>
+                <w:rtl/>
+                <w:rFonts w:ascii="Arial" w:cs="Arial" w:eastAsia="Arial" w:hAnsi="Arial"/>
+              </w:rPr>
+              <w:t xml:space="preserve">מה יש בפנים?</w:t>
+            </w:r>
+          </w:p>
+        </w:tc>
+        <w:tc>
+          <w:tcPr>
+            <w:tcW w:type="pct" w:w="28%"/>
+            <w:tcBorders>
+              <w:top w:val="single" w:color="D9D4C7" w:sz="4"/>
+              <w:left w:val="single" w:color="D9D4C7" w:sz="4"/>
+              <w:bottom w:val="single" w:color="D9D4C7" w:sz="4"/>
+              <w:right w:val="single" w:color="D9D4C7" w:sz="4"/>
+            </w:tcBorders>
+            <w:tcMar>
+              <w:top w:type="dxa" w:w="80"/>
+              <w:left w:type="dxa" w:w="120"/>
+              <w:bottom w:type="dxa" w:w="80"/>
+              <w:right w:type="dxa" w:w="120"/>
+            </w:tcMar>
+          </w:tcPr>
+          <w:p>
+            <w:pPr>
+              <w:bidi/>
+              <w:spacing w:before="0" w:after="0" w:line="300"/>
+              <w:jc w:val="right"/>
+            </w:pPr>
+            <w:r>
+              <w:rPr>
+                <w:color w:val="171512"/>
+                <w:sz w:val="21"/>
+                <w:szCs w:val="21"/>
+                <w:rtl/>
+                <w:rFonts w:ascii="Arial" w:cs="Arial" w:eastAsia="Arial" w:hAnsi="Arial"/>
+              </w:rPr>
+            </w:r>
+          </w:p>
+        </w:tc>
+      </w:tr>
+      <w:tr>
+        <w:tc>
+          <w:tcPr>
+            <w:tcW w:type="pct" w:w="22%"/>
+            <w:tcBorders>
+              <w:top w:val="single" w:color="D9D4C7" w:sz="4"/>
+              <w:left w:val="single" w:color="D9D4C7" w:sz="4"/>
+              <w:bottom w:val="single" w:color="D9D4C7" w:sz="4"/>
+              <w:right w:val="single" w:color="D9D4C7" w:sz="4"/>
+            </w:tcBorders>
+            <w:tcMar>
+              <w:top w:type="dxa" w:w="80"/>
+              <w:left w:type="dxa" w:w="120"/>
+              <w:bottom w:type="dxa" w:w="80"/>
+              <w:right w:type="dxa" w:w="120"/>
+            </w:tcMar>
+          </w:tcPr>
+          <w:p>
+            <w:pPr>
+              <w:bidi/>
+              <w:spacing w:before="0" w:after="0" w:line="300"/>
+              <w:jc w:val="right"/>
+            </w:pPr>
+            <w:r>
+              <w:rPr>
+                <w:color w:val="171512"/>
+                <w:sz w:val="21"/>
+                <w:szCs w:val="21"/>
+                <w:rtl/>
+                <w:rFonts w:ascii="Arial" w:cs="Arial" w:eastAsia="Arial" w:hAnsi="Arial"/>
+              </w:rPr>
+              <w:t xml:space="preserve">תשובה 7</w:t>
+            </w:r>
+          </w:p>
+        </w:tc>
+        <w:tc>
+          <w:tcPr>
+            <w:tcW w:type="pct" w:w="50%"/>
+            <w:tcBorders>
+              <w:top w:val="single" w:color="D9D4C7" w:sz="4"/>
+              <w:left w:val="single" w:color="D9D4C7" w:sz="4"/>
+              <w:bottom w:val="single" w:color="D9D4C7" w:sz="4"/>
+              <w:right w:val="single" w:color="D9D4C7" w:sz="4"/>
+            </w:tcBorders>
+            <w:tcMar>
+              <w:top w:type="dxa" w:w="80"/>
+              <w:left w:type="dxa" w:w="120"/>
+              <w:bottom w:type="dxa" w:w="80"/>
+              <w:right w:type="dxa" w:w="120"/>
+            </w:tcMar>
+          </w:tcPr>
+          <w:p>
+            <w:pPr>
+              <w:bidi/>
+              <w:spacing w:before="0" w:after="0" w:line="300"/>
+              <w:jc w:val="right"/>
+            </w:pPr>
+            <w:r>
+              <w:rPr>
+                <w:color w:val="171512"/>
+                <w:sz w:val="21"/>
+                <w:szCs w:val="21"/>
+                <w:rtl/>
+                <w:rFonts w:ascii="Arial" w:cs="Arial" w:eastAsia="Arial" w:hAnsi="Arial"/>
+              </w:rPr>
               <w:t xml:space="preserve">מים, Cetrimonium Chloride, Cetyl Alcohol, Stearyl Alcohol, Isopropyl Myristate, Propylene Glycol, Silicone Quaternium-8, קרטין, תמצית משי (Silkworm Extract), Behentrimonium Chloride, שמן זרעי חמניות, גליצרין, ניחוח, DMDM Hydantoin.</w:t>
             </w:r>
           </w:p>
@@ -9781,7 +9730,7 @@
                 <w:rtl/>
                 <w:rFonts w:ascii="Arial" w:cs="Arial" w:eastAsia="Arial" w:hAnsi="Arial"/>
               </w:rPr>
-              <w:t xml:space="preserve">רשימת רכיבים מהאריזה. לא לשנות עובדות, אפשר לשפר ניסוח.</w:t>
+              <w:t xml:space="preserve">רשימת רכיבים מהאריזה. לא לשנות עובדות.</w:t>
             </w:r>
           </w:p>
         </w:tc>
@@ -9899,7 +9848,7 @@
                 <w:rtl/>
                 <w:rFonts w:ascii="Arial" w:cs="Arial" w:eastAsia="Arial" w:hAnsi="Arial"/>
               </w:rPr>
-              <w:t xml:space="preserve">הטקסט הנוכחי באתר</w:t>
+              <w:t xml:space="preserve">הטקסט באתר</w:t>
             </w:r>
           </w:p>
         </w:tc>
@@ -9936,7 +9885,7 @@
                 <w:rtl/>
                 <w:rFonts w:ascii="Arial" w:cs="Arial" w:eastAsia="Arial" w:hAnsi="Arial"/>
               </w:rPr>
-              <w:t xml:space="preserve">הערות לקופירייטר</w:t>
+              <w:t xml:space="preserve">הערות ומגבלות</w:t>
             </w:r>
           </w:p>
         </w:tc>
@@ -10109,7 +10058,7 @@
                 <w:rtl/>
                 <w:rFonts w:ascii="Arial" w:cs="Arial" w:eastAsia="Arial" w:hAnsi="Arial"/>
               </w:rPr>
-              <w:t xml:space="preserve">הזמינו עכשיו</w:t>
+              <w:t xml:space="preserve">מזמינים עכשיו, משלמים אחר כך</w:t>
             </w:r>
           </w:p>
         </w:tc>
@@ -10143,6 +10092,7 @@
                 <w:rtl/>
                 <w:rFonts w:ascii="Arial" w:cs="Arial" w:eastAsia="Arial" w:hAnsi="Arial"/>
               </w:rPr>
+              <w:t xml:space="preserve">הכותרת מנטרלת את חשש התשלום עוד לפני הטופס.</w:t>
             </w:r>
           </w:p>
         </w:tc>
@@ -10212,7 +10162,7 @@
                 <w:rtl/>
                 <w:rFonts w:ascii="Arial" w:cs="Arial" w:eastAsia="Arial" w:hAnsi="Arial"/>
               </w:rPr>
-              <w:t xml:space="preserve">ממלאים פרטים, אנחנו חוזרים אליכם לאישור ולתיאום תשלום. משלוח כלול במחיר.</w:t>
+              <w:t xml:space="preserve">ממלאים פרטים, אנחנו מתקשרים לאשר, ורק אז מתאמים תשלום. המשלוח כלול במחיר.</w:t>
             </w:r>
           </w:p>
         </w:tc>
@@ -10315,7 +10265,7 @@
                 <w:rtl/>
                 <w:rFonts w:ascii="Arial" w:cs="Arial" w:eastAsia="Arial" w:hAnsi="Arial"/>
               </w:rPr>
-              <w:t xml:space="preserve">משלוח כלול במחיר</w:t>
+              <w:t xml:space="preserve">המשלוח כלול במחיר</w:t>
             </w:r>
           </w:p>
         </w:tc>
@@ -10419,7 +10369,7 @@
                 <w:rtl/>
                 <w:rFonts w:ascii="Arial" w:cs="Arial" w:eastAsia="Arial" w:hAnsi="Arial"/>
               </w:rPr>
-              <w:t xml:space="preserve">תשלום רק אחרי אישור טלפוני</w:t>
+              <w:t xml:space="preserve">באתר לא משלמים כלום</w:t>
             </w:r>
           </w:p>
         </w:tc>
@@ -10763,7 +10713,6 @@
                 <w:rtl/>
                 <w:rFonts w:ascii="Arial" w:cs="Arial" w:eastAsia="Arial" w:hAnsi="Arial"/>
               </w:rPr>
-              <w:t xml:space="preserve">תווית, מחיר, הערה.</w:t>
             </w:r>
           </w:p>
         </w:tc>
@@ -10833,7 +10782,7 @@
                 <w:rtl/>
                 <w:rFonts w:ascii="Arial" w:cs="Arial" w:eastAsia="Arial" w:hAnsi="Arial"/>
               </w:rPr>
-              <w:t xml:space="preserve">המבצע / 2 קופסאות / 419 ₪ / 48 שקיות · חיסכון 79 ₪</w:t>
+              <w:t xml:space="preserve">הכי משתלם / 2 קופסאות / 419 ₪ / 48 שקיות · חוסכים 79 ₪</w:t>
             </w:r>
           </w:p>
         </w:tc>
@@ -10867,7 +10816,6 @@
                 <w:rtl/>
                 <w:rFonts w:ascii="Arial" w:cs="Arial" w:eastAsia="Arial" w:hAnsi="Arial"/>
               </w:rPr>
-              <w:t xml:space="preserve">תג, תווית, מחיר, הערה.</w:t>
             </w:r>
           </w:p>
         </w:tc>
@@ -11452,7 +11400,7 @@
                 <w:rtl/>
                 <w:rFonts w:ascii="Arial" w:cs="Arial" w:eastAsia="Arial" w:hAnsi="Arial"/>
               </w:rPr>
-              <w:t xml:space="preserve">סה״כ לתשלום</w:t>
+              <w:t xml:space="preserve">סה״כ להזמנה</w:t>
             </w:r>
           </w:p>
         </w:tc>
@@ -11486,6 +11434,7 @@
                 <w:rtl/>
                 <w:rFonts w:ascii="Arial" w:cs="Arial" w:eastAsia="Arial" w:hAnsi="Arial"/>
               </w:rPr>
+              <w:t xml:space="preserve">לא "לתשלום", כי לא משלמים באתר.</w:t>
             </w:r>
           </w:p>
         </w:tc>
@@ -11555,7 +11504,7 @@
                 <w:rtl/>
                 <w:rFonts w:ascii="Arial" w:cs="Arial" w:eastAsia="Arial" w:hAnsi="Arial"/>
               </w:rPr>
-              <w:t xml:space="preserve">שליחת הזמנה</w:t>
+              <w:t xml:space="preserve">שלחו את ההזמנה</w:t>
             </w:r>
           </w:p>
         </w:tc>
@@ -11589,7 +11538,7 @@
                 <w:rtl/>
                 <w:rFonts w:ascii="Arial" w:cs="Arial" w:eastAsia="Arial" w:hAnsi="Arial"/>
               </w:rPr>
-              <w:t xml:space="preserve">עד 3 מילים.</w:t>
+              <w:t xml:space="preserve">פועל בציווי, עד 3 מילים.</w:t>
             </w:r>
           </w:p>
         </w:tc>
@@ -11659,7 +11608,7 @@
                 <w:rtl/>
                 <w:rFonts w:ascii="Arial" w:cs="Arial" w:eastAsia="Arial" w:hAnsi="Arial"/>
               </w:rPr>
-              <w:t xml:space="preserve">בלחיצה על שליחה אתם מאשרים שניצור קשר לאישור ההזמנה. לא נדרש תשלום עכשיו.</w:t>
+              <w:t xml:space="preserve">אחרי השליחה אנחנו מתקשרים לאשר את ההזמנה. לא מחייבים כלום עכשיו.</w:t>
             </w:r>
           </w:p>
         </w:tc>
@@ -11693,7 +11642,7 @@
                 <w:rtl/>
                 <w:rFonts w:ascii="Arial" w:cs="Arial" w:eastAsia="Arial" w:hAnsi="Arial"/>
               </w:rPr>
-              <w:t xml:space="preserve">משפט או שניים. מרגיע, לא משפטי מדי.</w:t>
+              <w:t xml:space="preserve">מרגיע, לא משפטי.</w:t>
             </w:r>
           </w:p>
         </w:tc>
@@ -11763,7 +11712,7 @@
                 <w:rtl/>
                 <w:rFonts w:ascii="Arial" w:cs="Arial" w:eastAsia="Arial" w:hAnsi="Arial"/>
               </w:rPr>
-              <w:t xml:space="preserve">ההזמנה התקבלה</w:t>
+              <w:t xml:space="preserve">ההזמנה אצלנו</w:t>
             </w:r>
           </w:p>
         </w:tc>
@@ -11866,7 +11815,7 @@
                 <w:rtl/>
                 <w:rFonts w:ascii="Arial" w:cs="Arial" w:eastAsia="Arial" w:hAnsi="Arial"/>
               </w:rPr>
-              <w:t xml:space="preserve">תודה! נחזור אליכם בהקדם לאישור ולתיאום התשלום והמשלוח.</w:t>
+              <w:t xml:space="preserve">תודה! מתקשרים אליכם לאישור ולתיאום התשלום והמשלוח.</w:t>
             </w:r>
           </w:p>
         </w:tc>
@@ -11900,6 +11849,7 @@
                 <w:rtl/>
                 <w:rFonts w:ascii="Arial" w:cs="Arial" w:eastAsia="Arial" w:hAnsi="Arial"/>
               </w:rPr>
+              <w:t xml:space="preserve">אם נתחייב לזמן ("עד סוף היום") זה ישפר המרה. צריך אישור של איציק.</w:t>
             </w:r>
           </w:p>
         </w:tc>
@@ -11969,7 +11919,7 @@
                 <w:rtl/>
                 <w:rFonts w:ascii="Arial" w:cs="Arial" w:eastAsia="Arial" w:hAnsi="Arial"/>
               </w:rPr>
-              <w:t xml:space="preserve">איך קוראים לך? שם מלא בבקשה</w:t>
+              <w:t xml:space="preserve">רגע, איך קוראים לך?</w:t>
             </w:r>
           </w:p>
         </w:tc>
@@ -12073,7 +12023,7 @@
                 <w:rtl/>
                 <w:rFonts w:ascii="Arial" w:cs="Arial" w:eastAsia="Arial" w:hAnsi="Arial"/>
               </w:rPr>
-              <w:t xml:space="preserve">מספר טלפון ישראלי, לדוגמה 052-1234567</w:t>
+              <w:t xml:space="preserve">המספר לא נראה תקין. לדוגמה: 052-1234567</w:t>
             </w:r>
           </w:p>
         </w:tc>
@@ -12279,7 +12229,7 @@
                 <w:rtl/>
                 <w:rFonts w:ascii="Arial" w:cs="Arial" w:eastAsia="Arial" w:hAnsi="Arial"/>
               </w:rPr>
-              <w:t xml:space="preserve">רחוב ומספר בית למשלוח</w:t>
+              <w:t xml:space="preserve">רחוב ומספר בית, שנדע לאן לשלוח</w:t>
             </w:r>
           </w:p>
         </w:tc>
@@ -12382,7 +12332,7 @@
                 <w:rtl/>
                 <w:rFonts w:ascii="Arial" w:cs="Arial" w:eastAsia="Arial" w:hAnsi="Arial"/>
               </w:rPr>
-              <w:t xml:space="preserve">משהו השתבש בשליחה. נסו שוב, או כתבו לנו באינסטגרם.</w:t>
+              <w:t xml:space="preserve">משהו נתקע בשליחה. נסו שוב, או שלחו לנו הודעה באינסטגרם.</w:t>
             </w:r>
           </w:p>
         </w:tc>
@@ -12534,7 +12484,7 @@
                 <w:rtl/>
                 <w:rFonts w:ascii="Arial" w:cs="Arial" w:eastAsia="Arial" w:hAnsi="Arial"/>
               </w:rPr>
-              <w:t xml:space="preserve">הטקסט הנוכחי באתר</w:t>
+              <w:t xml:space="preserve">הטקסט באתר</w:t>
             </w:r>
           </w:p>
         </w:tc>
@@ -12571,7 +12521,7 @@
                 <w:rtl/>
                 <w:rFonts w:ascii="Arial" w:cs="Arial" w:eastAsia="Arial" w:hAnsi="Arial"/>
               </w:rPr>
-              <w:t xml:space="preserve">הערות לקופירייטר</w:t>
+              <w:t xml:space="preserve">הערות ומגבלות</w:t>
             </w:r>
           </w:p>
         </w:tc>
@@ -13026,7 +12976,7 @@
           <w:rtl/>
           <w:rFonts w:ascii="Arial" w:cs="Arial" w:eastAsia="Arial" w:hAnsi="Arial"/>
         </w:rPr>
-        <w:t xml:space="preserve">מופיע בתחתית המסך בנייד בזמן הגלילה, נעלם כשמגיעים לטופס.</w:t>
+        <w:t xml:space="preserve">מופיע בתחתית המסך בנייד בזמן הגלילה, ונעלם כשמגיעים לטופס.</w:t>
       </w:r>
     </w:p>
     <w:tbl>
@@ -13121,7 +13071,7 @@
                 <w:rtl/>
                 <w:rFonts w:ascii="Arial" w:cs="Arial" w:eastAsia="Arial" w:hAnsi="Arial"/>
               </w:rPr>
-              <w:t xml:space="preserve">הטקסט הנוכחי באתר</w:t>
+              <w:t xml:space="preserve">הטקסט באתר</w:t>
             </w:r>
           </w:p>
         </w:tc>
@@ -13158,7 +13108,7 @@
                 <w:rtl/>
                 <w:rFonts w:ascii="Arial" w:cs="Arial" w:eastAsia="Arial" w:hAnsi="Arial"/>
               </w:rPr>
-              <w:t xml:space="preserve">הערות לקופירייטר</w:t>
+              <w:t xml:space="preserve">הערות ומגבלות</w:t>
             </w:r>
           </w:p>
         </w:tc>
@@ -13483,7 +13433,7 @@
                 <w:rtl/>
                 <w:rFonts w:ascii="Arial" w:cs="Arial" w:eastAsia="Arial" w:hAnsi="Arial"/>
               </w:rPr>
-              <w:t xml:space="preserve">הטקסט הנוכחי באתר</w:t>
+              <w:t xml:space="preserve">הטקסט באתר</w:t>
             </w:r>
           </w:p>
         </w:tc>
@@ -13520,7 +13470,7 @@
                 <w:rtl/>
                 <w:rFonts w:ascii="Arial" w:cs="Arial" w:eastAsia="Arial" w:hAnsi="Arial"/>
               </w:rPr>
-              <w:t xml:space="preserve">הערות לקופירייטר</w:t>
+              <w:t xml:space="preserve">הערות ומגבלות</w:t>
             </w:r>
           </w:p>
         </w:tc>
@@ -13879,7 +13829,7 @@
           <w:rtl/>
           <w:rFonts w:ascii="Arial" w:cs="Arial" w:eastAsia="Arial" w:hAnsi="Arial"/>
         </w:rPr>
-        <w:t xml:space="preserve">אלה תבניות ההודעות שנשלחות ללקוח משלב ההזמנה ועד המסירה. השם, הכמות והסכום נכנסים אוטומטית (מסומנים בסוגריים מרובעים). אפשר לשכתב חופשי, לשמור על הפרטים המשתנים.</w:t>
+        <w:t xml:space="preserve">תבניות ההודעות משלב ההזמנה ועד המסירה. השם, הכמות והסכום נכנסים אוטומטית (בסוגריים מרובעים). אפשר לשכתב חופשי, רק לשמור על הפרטים המשתנים.</w:t>
       </w:r>
     </w:p>
     <w:tbl>
@@ -13974,7 +13924,7 @@
                 <w:rtl/>
                 <w:rFonts w:ascii="Arial" w:cs="Arial" w:eastAsia="Arial" w:hAnsi="Arial"/>
               </w:rPr>
-              <w:t xml:space="preserve">הטקסט הנוכחי באתר</w:t>
+              <w:t xml:space="preserve">הטקסט באתר</w:t>
             </w:r>
           </w:p>
         </w:tc>
@@ -14011,7 +13961,7 @@
                 <w:rtl/>
                 <w:rFonts w:ascii="Arial" w:cs="Arial" w:eastAsia="Arial" w:hAnsi="Arial"/>
               </w:rPr>
-              <w:t xml:space="preserve">הערות לקופירייטר</w:t>
+              <w:t xml:space="preserve">הערות ומגבלות</w:t>
             </w:r>
           </w:p>
         </w:tc>
@@ -14082,9 +14032,9 @@
                 <w:rFonts w:ascii="Arial" w:cs="Arial" w:eastAsia="Arial" w:hAnsi="Arial"/>
               </w:rPr>
               <w:t xml:space="preserve">היי [שם], כאן תאי סיקרט 🌿
-קיבלנו את ההזמנה שלך ([כמות] Green Bio Super Treatment, [סכום] ₪ כולל משלוח).
-איך נוח לך לשלם? ביט / פייבוקס / מזומן במשלוח.
-ברגע שהתשלום מאושר אנחנו שולחים 🙏</w:t>
+קיבלנו את ההזמנה: [כמות] Green Bio Super Treatment, [סכום] ₪ כולל משלוח.
+איך נוח לשלם? ביט, פייבוקס או מזומן במשלוח.
+ברגע שהתשלום מאושר החבילה יוצאת אליך 🙏</w:t>
             </w:r>
           </w:p>
         </w:tc>
@@ -14189,7 +14139,7 @@
                 <w:rFonts w:ascii="Arial" w:cs="Arial" w:eastAsia="Arial" w:hAnsi="Arial"/>
               </w:rPr>
               <w:t xml:space="preserve">היי [שם], התשלום התקבל, תודה! 🙏
-ההזמנה שלך יוצאת למשלוח בימים הקרובים ונעדכן אותך עם מספר מעקב.
+ההזמנה נארזת ויוצאת למשלוח בימים הקרובים. נעדכן אותך במספר מעקב ברגע שיהיה.
 תאי סיקרט</w:t>
             </w:r>
           </w:p>
@@ -14293,7 +14243,7 @@
                 <w:rtl/>
                 <w:rFonts w:ascii="Arial" w:cs="Arial" w:eastAsia="Arial" w:hAnsi="Arial"/>
               </w:rPr>
-              <w:t xml:space="preserve">היי [שם], ההזמנה שלך יצאה למשלוח 📦
+              <w:t xml:space="preserve">היי [שם], החבילה שלך בדרך 📦
 מספר מעקב: [מספר]
 מעקב: [קישור]
 תאי סיקרט</w:t>
@@ -14401,7 +14351,8 @@
                 <w:rFonts w:ascii="Arial" w:cs="Arial" w:eastAsia="Arial" w:hAnsi="Arial"/>
               </w:rPr>
               <w:t xml:space="preserve">היי [שם], מקווים שהחבילה הגיעה בשלום 🌿
-טיפ: שקית אחת על שיער נקי ולח, 2 עד 5 דקות, ושוטפים. נשמח לשמוע איך היה!
+תזכורת קצרה: שקית אחת על שיער נקי ולח, 2 עד 5 דקות, ושוטפים היטב.
+נשמח לשמוע איך יצא, ואם בא לך גם תמונה 🙂
 תאי סיקרט</w:t>
             </w:r>
           </w:p>
@@ -14436,7 +14387,7 @@
                 <w:rtl/>
                 <w:rFonts w:ascii="Arial" w:cs="Arial" w:eastAsia="Arial" w:hAnsi="Arial"/>
               </w:rPr>
-              <w:t xml:space="preserve">הזדמנות לבקש ביקורת או תמונה.</w:t>
+              <w:t xml:space="preserve">ההזדמנות לאסוף ביקורת ותמונה.</w:t>
             </w:r>
           </w:p>
         </w:tc>
@@ -14464,7 +14415,7 @@
           <w:rtl/>
           <w:rFonts w:ascii="Arial" w:cs="Arial" w:eastAsia="Arial" w:hAnsi="Arial"/>
         </w:rPr>
-        <w:t xml:space="preserve">עמוד 3: טקסטים שעדיין חסרים באתר (הצעות לכתיבה)</w:t>
+        <w:t xml:space="preserve">עמוד 3: מה שונה במעבר הקופי ולמה</w:t>
       </w:r>
     </w:p>
     <w:p>
@@ -14483,7 +14434,7 @@
           <w:rtl/>
           <w:rFonts w:ascii="Arial" w:cs="Arial" w:eastAsia="Arial" w:hAnsi="Arial"/>
         </w:rPr>
-        <w:t xml:space="preserve">אזורים שלא קיימים עדיין ושווה לכתוב להם טקסט, כדי שנוכל להוסיף אותם.</w:t>
+        <w:t xml:space="preserve">השינויים המרכזיים שנעשו ב-24/09/2026. מי שכותב נוסח חדש, שישמור על העקרונות האלה.</w:t>
       </w:r>
     </w:p>
     <w:tbl>
@@ -14578,7 +14529,7 @@
                 <w:rtl/>
                 <w:rFonts w:ascii="Arial" w:cs="Arial" w:eastAsia="Arial" w:hAnsi="Arial"/>
               </w:rPr>
-              <w:t xml:space="preserve">הטקסט הנוכחי באתר</w:t>
+              <w:t xml:space="preserve">הטקסט באתר</w:t>
             </w:r>
           </w:p>
         </w:tc>
@@ -14615,7 +14566,7 @@
                 <w:rtl/>
                 <w:rFonts w:ascii="Arial" w:cs="Arial" w:eastAsia="Arial" w:hAnsi="Arial"/>
               </w:rPr>
-              <w:t xml:space="preserve">הערות לקופירייטר</w:t>
+              <w:t xml:space="preserve">הערות ומגבלות</w:t>
             </w:r>
           </w:p>
         </w:tc>
@@ -14651,7 +14602,7 @@
                 <w:rtl/>
                 <w:rFonts w:ascii="Arial" w:cs="Arial" w:eastAsia="Arial" w:hAnsi="Arial"/>
               </w:rPr>
-              <w:t xml:space="preserve">הוכחה חברתית</w:t>
+              <w:t xml:space="preserve">הכותרת הראשית</w:t>
             </w:r>
           </w:p>
         </w:tc>
@@ -14685,7 +14636,7 @@
                 <w:rtl/>
                 <w:rFonts w:ascii="Arial" w:cs="Arial" w:eastAsia="Arial" w:hAnsi="Arial"/>
               </w:rPr>
-              <w:t xml:space="preserve">אין עדיין</w:t>
+              <w:t xml:space="preserve">היה: "השיער שלך עבר מספיק". עכשיו: שורת פתיח "אחרי החלקה, צבע או הבהרה" + כותרת "השיער שילם את המחיר".</w:t>
             </w:r>
           </w:p>
         </w:tc>
@@ -14719,7 +14670,7 @@
                 <w:rtl/>
                 <w:rFonts w:ascii="Arial" w:cs="Arial" w:eastAsia="Arial" w:hAnsi="Arial"/>
               </w:rPr>
-              <w:t xml:space="preserve">3 עד 5 המלצות קצרות של לקוחות (2 עד 3 משפטים כל אחת) + שם פרטי ועיר.</w:t>
+              <w:t xml:space="preserve">שורת הפתיח ממקדת את הקהל, הכותרת נותנת את המכה הרגשית. יחד זה משפט שלם.</w:t>
             </w:r>
           </w:p>
         </w:tc>
@@ -14755,7 +14706,7 @@
                 <w:rtl/>
                 <w:rFonts w:ascii="Arial" w:cs="Arial" w:eastAsia="Arial" w:hAnsi="Arial"/>
               </w:rPr>
-              <w:t xml:space="preserve">שורת "מי אנחנו"</w:t>
+              <w:t xml:space="preserve">קו מפריד ארוך</w:t>
             </w:r>
           </w:p>
         </w:tc>
@@ -14789,7 +14740,7 @@
                 <w:rtl/>
                 <w:rFonts w:ascii="Arial" w:cs="Arial" w:eastAsia="Arial" w:hAnsi="Arial"/>
               </w:rPr>
-              <w:t xml:space="preserve">אין עדיין</w:t>
+              <w:t xml:space="preserve">הוסר מכל האתר (היו 10).</w:t>
             </w:r>
           </w:p>
         </w:tc>
@@ -14823,7 +14774,7 @@
                 <w:rtl/>
                 <w:rFonts w:ascii="Arial" w:cs="Arial" w:eastAsia="Arial" w:hAnsi="Arial"/>
               </w:rPr>
-              <w:t xml:space="preserve">2 עד 3 משפטים: מי מייבא, למה דווקא המוצר הזה, מה הסיפור מתאילנד.</w:t>
+              <w:t xml:space="preserve">כלל בית קבוע: רק מקף רגיל או פסיק.</w:t>
             </w:r>
           </w:p>
         </w:tc>
@@ -14859,7 +14810,7 @@
                 <w:rtl/>
                 <w:rFonts w:ascii="Arial" w:cs="Arial" w:eastAsia="Arial" w:hAnsi="Arial"/>
               </w:rPr>
-              <w:t xml:space="preserve">אחריות / החזרות</w:t>
+              <w:t xml:space="preserve">כותרת ההזמנה</w:t>
             </w:r>
           </w:p>
         </w:tc>
@@ -14893,7 +14844,7 @@
                 <w:rtl/>
                 <w:rFonts w:ascii="Arial" w:cs="Arial" w:eastAsia="Arial" w:hAnsi="Arial"/>
               </w:rPr>
-              <w:t xml:space="preserve">אין עדיין</w:t>
+              <w:t xml:space="preserve">היה: "הזמינו עכשיו". עכשיו: "מזמינים עכשיו, משלמים אחר כך".</w:t>
             </w:r>
           </w:p>
         </w:tc>
@@ -14927,7 +14878,7 @@
                 <w:rtl/>
                 <w:rFonts w:ascii="Arial" w:cs="Arial" w:eastAsia="Arial" w:hAnsi="Arial"/>
               </w:rPr>
-              <w:t xml:space="preserve">משפט אחד ברור על מדיניות החזרה (לאשר עם איציק).</w:t>
+              <w:t xml:space="preserve">החשש הכי גדול בקנייה מאתר קטן הוא התשלום. הכותרת מנטרלת אותו.</w:t>
             </w:r>
           </w:p>
         </w:tc>
@@ -14963,7 +14914,7 @@
                 <w:rtl/>
                 <w:rFonts w:ascii="Arial" w:cs="Arial" w:eastAsia="Arial" w:hAnsi="Arial"/>
               </w:rPr>
-              <w:t xml:space="preserve">ביו לאינסטגרם</w:t>
+              <w:t xml:space="preserve">כותרת "איך משתמשים"</w:t>
             </w:r>
           </w:p>
         </w:tc>
@@ -14997,7 +14948,7 @@
                 <w:rtl/>
                 <w:rFonts w:ascii="Arial" w:cs="Arial" w:eastAsia="Arial" w:hAnsi="Arial"/>
               </w:rPr>
-              <w:t xml:space="preserve">אין עדיין</w:t>
+              <w:t xml:space="preserve">היה: "ארבעה צעדים". עכשיו: "חופפים, מורחים, שוטפים".</w:t>
             </w:r>
           </w:p>
         </w:tc>
@@ -15031,7 +14982,7 @@
                 <w:rtl/>
                 <w:rFonts w:ascii="Arial" w:cs="Arial" w:eastAsia="Arial" w:hAnsi="Arial"/>
               </w:rPr>
-              <w:t xml:space="preserve">עד 150 תווים, עם קריאה לפעולה לאתר.</w:t>
+              <w:t xml:space="preserve">כותרות הסקשנים לבד צריכות לספר את הסיפור. "ארבעה צעדים" לא אומר כלום.</w:t>
             </w:r>
           </w:p>
         </w:tc>
@@ -15067,6 +15018,1225 @@
                 <w:rtl/>
                 <w:rFonts w:ascii="Arial" w:cs="Arial" w:eastAsia="Arial" w:hAnsi="Arial"/>
               </w:rPr>
+              <w:t xml:space="preserve">שתי שאלות חדשות ב-FAQ</w:t>
+            </w:r>
+          </w:p>
+        </w:tc>
+        <w:tc>
+          <w:tcPr>
+            <w:tcW w:type="pct" w:w="50%"/>
+            <w:tcBorders>
+              <w:top w:val="single" w:color="D9D4C7" w:sz="4"/>
+              <w:left w:val="single" w:color="D9D4C7" w:sz="4"/>
+              <w:bottom w:val="single" w:color="D9D4C7" w:sz="4"/>
+              <w:right w:val="single" w:color="D9D4C7" w:sz="4"/>
+            </w:tcBorders>
+            <w:tcMar>
+              <w:top w:type="dxa" w:w="80"/>
+              <w:left w:type="dxa" w:w="120"/>
+              <w:bottom w:type="dxa" w:w="80"/>
+              <w:right w:type="dxa" w:w="120"/>
+            </w:tcMar>
+          </w:tcPr>
+          <w:p>
+            <w:pPr>
+              <w:bidi/>
+              <w:spacing w:before="0" w:after="0" w:line="300"/>
+              <w:jc w:val="right"/>
+            </w:pPr>
+            <w:r>
+              <w:rPr>
+                <w:color w:val="171512"/>
+                <w:sz w:val="21"/>
+                <w:szCs w:val="21"/>
+                <w:rtl/>
+                <w:rFonts w:ascii="Arial" w:cs="Arial" w:eastAsia="Arial" w:hAnsi="Arial"/>
+              </w:rPr>
+              <w:t xml:space="preserve">נוספו: "ניסיתי מסכות ולא ראיתי שינוי" ו-"זה בטוח לשיער צבוע או מוחלק?".</w:t>
+            </w:r>
+          </w:p>
+        </w:tc>
+        <w:tc>
+          <w:tcPr>
+            <w:tcW w:type="pct" w:w="28%"/>
+            <w:tcBorders>
+              <w:top w:val="single" w:color="D9D4C7" w:sz="4"/>
+              <w:left w:val="single" w:color="D9D4C7" w:sz="4"/>
+              <w:bottom w:val="single" w:color="D9D4C7" w:sz="4"/>
+              <w:right w:val="single" w:color="D9D4C7" w:sz="4"/>
+            </w:tcBorders>
+            <w:tcMar>
+              <w:top w:type="dxa" w:w="80"/>
+              <w:left w:type="dxa" w:w="120"/>
+              <w:bottom w:type="dxa" w:w="80"/>
+              <w:right w:type="dxa" w:w="120"/>
+            </w:tcMar>
+          </w:tcPr>
+          <w:p>
+            <w:pPr>
+              <w:bidi/>
+              <w:spacing w:before="0" w:after="0" w:line="300"/>
+              <w:jc w:val="right"/>
+            </w:pPr>
+            <w:r>
+              <w:rPr>
+                <w:color w:val="171512"/>
+                <w:sz w:val="21"/>
+                <w:szCs w:val="21"/>
+                <w:rtl/>
+                <w:rFonts w:ascii="Arial" w:cs="Arial" w:eastAsia="Arial" w:hAnsi="Arial"/>
+              </w:rPr>
+              <w:t xml:space="preserve">שתי ההתנגדויות שעוצרות הזמנה. FAQ הוא אזור של התנגדויות, לא של מידע.</w:t>
+            </w:r>
+          </w:p>
+        </w:tc>
+      </w:tr>
+      <w:tr>
+        <w:tc>
+          <w:tcPr>
+            <w:tcW w:type="pct" w:w="22%"/>
+            <w:tcBorders>
+              <w:top w:val="single" w:color="D9D4C7" w:sz="4"/>
+              <w:left w:val="single" w:color="D9D4C7" w:sz="4"/>
+              <w:bottom w:val="single" w:color="D9D4C7" w:sz="4"/>
+              <w:right w:val="single" w:color="D9D4C7" w:sz="4"/>
+            </w:tcBorders>
+            <w:tcMar>
+              <w:top w:type="dxa" w:w="80"/>
+              <w:left w:type="dxa" w:w="120"/>
+              <w:bottom w:type="dxa" w:w="80"/>
+              <w:right w:type="dxa" w:w="120"/>
+            </w:tcMar>
+          </w:tcPr>
+          <w:p>
+            <w:pPr>
+              <w:bidi/>
+              <w:spacing w:before="0" w:after="0" w:line="300"/>
+              <w:jc w:val="right"/>
+            </w:pPr>
+            <w:r>
+              <w:rPr>
+                <w:color w:val="171512"/>
+                <w:sz w:val="21"/>
+                <w:szCs w:val="21"/>
+                <w:rtl/>
+                <w:rFonts w:ascii="Arial" w:cs="Arial" w:eastAsia="Arial" w:hAnsi="Arial"/>
+              </w:rPr>
+              <w:t xml:space="preserve">"המבצע" הפך ל"הכי משתלם"</w:t>
+            </w:r>
+          </w:p>
+        </w:tc>
+        <w:tc>
+          <w:tcPr>
+            <w:tcW w:type="pct" w:w="50%"/>
+            <w:tcBorders>
+              <w:top w:val="single" w:color="D9D4C7" w:sz="4"/>
+              <w:left w:val="single" w:color="D9D4C7" w:sz="4"/>
+              <w:bottom w:val="single" w:color="D9D4C7" w:sz="4"/>
+              <w:right w:val="single" w:color="D9D4C7" w:sz="4"/>
+            </w:tcBorders>
+            <w:tcMar>
+              <w:top w:type="dxa" w:w="80"/>
+              <w:left w:type="dxa" w:w="120"/>
+              <w:bottom w:type="dxa" w:w="80"/>
+              <w:right w:type="dxa" w:w="120"/>
+            </w:tcMar>
+          </w:tcPr>
+          <w:p>
+            <w:pPr>
+              <w:bidi/>
+              <w:spacing w:before="0" w:after="0" w:line="300"/>
+              <w:jc w:val="right"/>
+            </w:pPr>
+            <w:r>
+              <w:rPr>
+                <w:color w:val="171512"/>
+                <w:sz w:val="21"/>
+                <w:szCs w:val="21"/>
+                <w:rtl/>
+                <w:rFonts w:ascii="Arial" w:cs="Arial" w:eastAsia="Arial" w:hAnsi="Arial"/>
+              </w:rPr>
+              <w:t xml:space="preserve">בכרטיס המחיר ובטופס.</w:t>
+            </w:r>
+          </w:p>
+        </w:tc>
+        <w:tc>
+          <w:tcPr>
+            <w:tcW w:type="pct" w:w="28%"/>
+            <w:tcBorders>
+              <w:top w:val="single" w:color="D9D4C7" w:sz="4"/>
+              <w:left w:val="single" w:color="D9D4C7" w:sz="4"/>
+              <w:bottom w:val="single" w:color="D9D4C7" w:sz="4"/>
+              <w:right w:val="single" w:color="D9D4C7" w:sz="4"/>
+            </w:tcBorders>
+            <w:tcMar>
+              <w:top w:type="dxa" w:w="80"/>
+              <w:left w:type="dxa" w:w="120"/>
+              <w:bottom w:type="dxa" w:w="80"/>
+              <w:right w:type="dxa" w:w="120"/>
+            </w:tcMar>
+          </w:tcPr>
+          <w:p>
+            <w:pPr>
+              <w:bidi/>
+              <w:spacing w:before="0" w:after="0" w:line="300"/>
+              <w:jc w:val="right"/>
+            </w:pPr>
+            <w:r>
+              <w:rPr>
+                <w:color w:val="171512"/>
+                <w:sz w:val="21"/>
+                <w:szCs w:val="21"/>
+                <w:rtl/>
+                <w:rFonts w:ascii="Arial" w:cs="Arial" w:eastAsia="Arial" w:hAnsi="Arial"/>
+              </w:rPr>
+              <w:t xml:space="preserve">"מבצע" נשמע כמו דוכן. "הכי משתלם" מסביר למה לבחור בזה.</w:t>
+            </w:r>
+          </w:p>
+        </w:tc>
+      </w:tr>
+      <w:tr>
+        <w:tc>
+          <w:tcPr>
+            <w:tcW w:type="pct" w:w="22%"/>
+            <w:tcBorders>
+              <w:top w:val="single" w:color="D9D4C7" w:sz="4"/>
+              <w:left w:val="single" w:color="D9D4C7" w:sz="4"/>
+              <w:bottom w:val="single" w:color="D9D4C7" w:sz="4"/>
+              <w:right w:val="single" w:color="D9D4C7" w:sz="4"/>
+            </w:tcBorders>
+            <w:tcMar>
+              <w:top w:type="dxa" w:w="80"/>
+              <w:left w:type="dxa" w:w="120"/>
+              <w:bottom w:type="dxa" w:w="80"/>
+              <w:right w:type="dxa" w:w="120"/>
+            </w:tcMar>
+          </w:tcPr>
+          <w:p>
+            <w:pPr>
+              <w:bidi/>
+              <w:spacing w:before="0" w:after="0" w:line="300"/>
+              <w:jc w:val="right"/>
+            </w:pPr>
+            <w:r>
+              <w:rPr>
+                <w:color w:val="171512"/>
+                <w:sz w:val="21"/>
+                <w:szCs w:val="21"/>
+                <w:rtl/>
+                <w:rFonts w:ascii="Arial" w:cs="Arial" w:eastAsia="Arial" w:hAnsi="Arial"/>
+              </w:rPr>
+              <w:t xml:space="preserve">הודעות שגיאה</w:t>
+            </w:r>
+          </w:p>
+        </w:tc>
+        <w:tc>
+          <w:tcPr>
+            <w:tcW w:type="pct" w:w="50%"/>
+            <w:tcBorders>
+              <w:top w:val="single" w:color="D9D4C7" w:sz="4"/>
+              <w:left w:val="single" w:color="D9D4C7" w:sz="4"/>
+              <w:bottom w:val="single" w:color="D9D4C7" w:sz="4"/>
+              <w:right w:val="single" w:color="D9D4C7" w:sz="4"/>
+            </w:tcBorders>
+            <w:tcMar>
+              <w:top w:type="dxa" w:w="80"/>
+              <w:left w:type="dxa" w:w="120"/>
+              <w:bottom w:type="dxa" w:w="80"/>
+              <w:right w:type="dxa" w:w="120"/>
+            </w:tcMar>
+          </w:tcPr>
+          <w:p>
+            <w:pPr>
+              <w:bidi/>
+              <w:spacing w:before="0" w:after="0" w:line="300"/>
+              <w:jc w:val="right"/>
+            </w:pPr>
+            <w:r>
+              <w:rPr>
+                <w:color w:val="171512"/>
+                <w:sz w:val="21"/>
+                <w:szCs w:val="21"/>
+                <w:rtl/>
+                <w:rFonts w:ascii="Arial" w:cs="Arial" w:eastAsia="Arial" w:hAnsi="Arial"/>
+              </w:rPr>
+              <w:t xml:space="preserve">היה: "איך קוראים לך? שם מלא בבקשה". עכשיו: "רגע, איך קוראים לך?".</w:t>
+            </w:r>
+          </w:p>
+        </w:tc>
+        <w:tc>
+          <w:tcPr>
+            <w:tcW w:type="pct" w:w="28%"/>
+            <w:tcBorders>
+              <w:top w:val="single" w:color="D9D4C7" w:sz="4"/>
+              <w:left w:val="single" w:color="D9D4C7" w:sz="4"/>
+              <w:bottom w:val="single" w:color="D9D4C7" w:sz="4"/>
+              <w:right w:val="single" w:color="D9D4C7" w:sz="4"/>
+            </w:tcBorders>
+            <w:tcMar>
+              <w:top w:type="dxa" w:w="80"/>
+              <w:left w:type="dxa" w:w="120"/>
+              <w:bottom w:type="dxa" w:w="80"/>
+              <w:right w:type="dxa" w:w="120"/>
+            </w:tcMar>
+          </w:tcPr>
+          <w:p>
+            <w:pPr>
+              <w:bidi/>
+              <w:spacing w:before="0" w:after="0" w:line="300"/>
+              <w:jc w:val="right"/>
+            </w:pPr>
+            <w:r>
+              <w:rPr>
+                <w:color w:val="171512"/>
+                <w:sz w:val="21"/>
+                <w:szCs w:val="21"/>
+                <w:rtl/>
+                <w:rFonts w:ascii="Arial" w:cs="Arial" w:eastAsia="Arial" w:hAnsi="Arial"/>
+              </w:rPr>
+              <w:t xml:space="preserve">שגיאה היא רגע של תסכול. ככל שהמשפט קצר ואנושי יותר, פחות נוטשים.</w:t>
+            </w:r>
+          </w:p>
+        </w:tc>
+      </w:tr>
+      <w:tr>
+        <w:tc>
+          <w:tcPr>
+            <w:tcW w:type="pct" w:w="22%"/>
+            <w:tcBorders>
+              <w:top w:val="single" w:color="D9D4C7" w:sz="4"/>
+              <w:left w:val="single" w:color="D9D4C7" w:sz="4"/>
+              <w:bottom w:val="single" w:color="D9D4C7" w:sz="4"/>
+              <w:right w:val="single" w:color="D9D4C7" w:sz="4"/>
+            </w:tcBorders>
+            <w:tcMar>
+              <w:top w:type="dxa" w:w="80"/>
+              <w:left w:type="dxa" w:w="120"/>
+              <w:bottom w:type="dxa" w:w="80"/>
+              <w:right w:type="dxa" w:w="120"/>
+            </w:tcMar>
+          </w:tcPr>
+          <w:p>
+            <w:pPr>
+              <w:bidi/>
+              <w:spacing w:before="0" w:after="0" w:line="300"/>
+              <w:jc w:val="right"/>
+            </w:pPr>
+            <w:r>
+              <w:rPr>
+                <w:color w:val="171512"/>
+                <w:sz w:val="21"/>
+                <w:szCs w:val="21"/>
+                <w:rtl/>
+                <w:rFonts w:ascii="Arial" w:cs="Arial" w:eastAsia="Arial" w:hAnsi="Arial"/>
+              </w:rPr>
+              <w:t xml:space="preserve">"סה״כ לתשלום" הפך ל"סה״כ להזמנה"</w:t>
+            </w:r>
+          </w:p>
+        </w:tc>
+        <w:tc>
+          <w:tcPr>
+            <w:tcW w:type="pct" w:w="50%"/>
+            <w:tcBorders>
+              <w:top w:val="single" w:color="D9D4C7" w:sz="4"/>
+              <w:left w:val="single" w:color="D9D4C7" w:sz="4"/>
+              <w:bottom w:val="single" w:color="D9D4C7" w:sz="4"/>
+              <w:right w:val="single" w:color="D9D4C7" w:sz="4"/>
+            </w:tcBorders>
+            <w:tcMar>
+              <w:top w:type="dxa" w:w="80"/>
+              <w:left w:type="dxa" w:w="120"/>
+              <w:bottom w:type="dxa" w:w="80"/>
+              <w:right w:type="dxa" w:w="120"/>
+            </w:tcMar>
+          </w:tcPr>
+          <w:p>
+            <w:pPr>
+              <w:bidi/>
+              <w:spacing w:before="0" w:after="0" w:line="300"/>
+              <w:jc w:val="right"/>
+            </w:pPr>
+            <w:r>
+              <w:rPr>
+                <w:color w:val="171512"/>
+                <w:sz w:val="21"/>
+                <w:szCs w:val="21"/>
+                <w:rtl/>
+                <w:rFonts w:ascii="Arial" w:cs="Arial" w:eastAsia="Arial" w:hAnsi="Arial"/>
+              </w:rPr>
+              <w:t xml:space="preserve">בשורת הסיכום בטופס.</w:t>
+            </w:r>
+          </w:p>
+        </w:tc>
+        <w:tc>
+          <w:tcPr>
+            <w:tcW w:type="pct" w:w="28%"/>
+            <w:tcBorders>
+              <w:top w:val="single" w:color="D9D4C7" w:sz="4"/>
+              <w:left w:val="single" w:color="D9D4C7" w:sz="4"/>
+              <w:bottom w:val="single" w:color="D9D4C7" w:sz="4"/>
+              <w:right w:val="single" w:color="D9D4C7" w:sz="4"/>
+            </w:tcBorders>
+            <w:tcMar>
+              <w:top w:type="dxa" w:w="80"/>
+              <w:left w:type="dxa" w:w="120"/>
+              <w:bottom w:type="dxa" w:w="80"/>
+              <w:right w:type="dxa" w:w="120"/>
+            </w:tcMar>
+          </w:tcPr>
+          <w:p>
+            <w:pPr>
+              <w:bidi/>
+              <w:spacing w:before="0" w:after="0" w:line="300"/>
+              <w:jc w:val="right"/>
+            </w:pPr>
+            <w:r>
+              <w:rPr>
+                <w:color w:val="171512"/>
+                <w:sz w:val="21"/>
+                <w:szCs w:val="21"/>
+                <w:rtl/>
+                <w:rFonts w:ascii="Arial" w:cs="Arial" w:eastAsia="Arial" w:hAnsi="Arial"/>
+              </w:rPr>
+              <w:t xml:space="preserve">באתר לא משלמים, אז "לתשלום" סותר את ההבטחה.</w:t>
+            </w:r>
+          </w:p>
+        </w:tc>
+      </w:tr>
+      <w:tr>
+        <w:tc>
+          <w:tcPr>
+            <w:tcW w:type="pct" w:w="22%"/>
+            <w:tcBorders>
+              <w:top w:val="single" w:color="D9D4C7" w:sz="4"/>
+              <w:left w:val="single" w:color="D9D4C7" w:sz="4"/>
+              <w:bottom w:val="single" w:color="D9D4C7" w:sz="4"/>
+              <w:right w:val="single" w:color="D9D4C7" w:sz="4"/>
+            </w:tcBorders>
+            <w:tcMar>
+              <w:top w:type="dxa" w:w="80"/>
+              <w:left w:type="dxa" w:w="120"/>
+              <w:bottom w:type="dxa" w:w="80"/>
+              <w:right w:type="dxa" w:w="120"/>
+            </w:tcMar>
+          </w:tcPr>
+          <w:p>
+            <w:pPr>
+              <w:bidi/>
+              <w:spacing w:before="0" w:after="0" w:line="300"/>
+              <w:jc w:val="right"/>
+            </w:pPr>
+            <w:r>
+              <w:rPr>
+                <w:color w:val="171512"/>
+                <w:sz w:val="21"/>
+                <w:szCs w:val="21"/>
+                <w:rtl/>
+                <w:rFonts w:ascii="Arial" w:cs="Arial" w:eastAsia="Arial" w:hAnsi="Arial"/>
+              </w:rPr>
+              <w:t xml:space="preserve">הודעות הוואטסאפ</w:t>
+            </w:r>
+          </w:p>
+        </w:tc>
+        <w:tc>
+          <w:tcPr>
+            <w:tcW w:type="pct" w:w="50%"/>
+            <w:tcBorders>
+              <w:top w:val="single" w:color="D9D4C7" w:sz="4"/>
+              <w:left w:val="single" w:color="D9D4C7" w:sz="4"/>
+              <w:bottom w:val="single" w:color="D9D4C7" w:sz="4"/>
+              <w:right w:val="single" w:color="D9D4C7" w:sz="4"/>
+            </w:tcBorders>
+            <w:tcMar>
+              <w:top w:type="dxa" w:w="80"/>
+              <w:left w:type="dxa" w:w="120"/>
+              <w:bottom w:type="dxa" w:w="80"/>
+              <w:right w:type="dxa" w:w="120"/>
+            </w:tcMar>
+          </w:tcPr>
+          <w:p>
+            <w:pPr>
+              <w:bidi/>
+              <w:spacing w:before="0" w:after="0" w:line="300"/>
+              <w:jc w:val="right"/>
+            </w:pPr>
+            <w:r>
+              <w:rPr>
+                <w:color w:val="171512"/>
+                <w:sz w:val="21"/>
+                <w:szCs w:val="21"/>
+                <w:rtl/>
+                <w:rFonts w:ascii="Arial" w:cs="Arial" w:eastAsia="Arial" w:hAnsi="Arial"/>
+              </w:rPr>
+              <w:t xml:space="preserve">קוצרו ונוקו. "איך נוח לך לשלם?" הפך ל"איך נוח לשלם?".</w:t>
+            </w:r>
+          </w:p>
+        </w:tc>
+        <w:tc>
+          <w:tcPr>
+            <w:tcW w:type="pct" w:w="28%"/>
+            <w:tcBorders>
+              <w:top w:val="single" w:color="D9D4C7" w:sz="4"/>
+              <w:left w:val="single" w:color="D9D4C7" w:sz="4"/>
+              <w:bottom w:val="single" w:color="D9D4C7" w:sz="4"/>
+              <w:right w:val="single" w:color="D9D4C7" w:sz="4"/>
+            </w:tcBorders>
+            <w:tcMar>
+              <w:top w:type="dxa" w:w="80"/>
+              <w:left w:type="dxa" w:w="120"/>
+              <w:bottom w:type="dxa" w:w="80"/>
+              <w:right w:type="dxa" w:w="120"/>
+            </w:tcMar>
+          </w:tcPr>
+          <w:p>
+            <w:pPr>
+              <w:bidi/>
+              <w:spacing w:before="0" w:after="0" w:line="300"/>
+              <w:jc w:val="right"/>
+            </w:pPr>
+            <w:r>
+              <w:rPr>
+                <w:color w:val="171512"/>
+                <w:sz w:val="21"/>
+                <w:szCs w:val="21"/>
+                <w:rtl/>
+                <w:rFonts w:ascii="Arial" w:cs="Arial" w:eastAsia="Arial" w:hAnsi="Arial"/>
+              </w:rPr>
+              <w:t xml:space="preserve">ההודעות נקראות בנייד תוך שתי שניות. כל מילה מיותרת מורידה תגובה.</w:t>
+            </w:r>
+          </w:p>
+        </w:tc>
+      </w:tr>
+    </w:tbl>
+    <w:p>
+      <w:r>
+        <w:br w:type="page"/>
+      </w:r>
+    </w:p>
+    <w:p>
+      <w:pPr>
+        <w:pStyle w:val="Heading1"/>
+        <w:bidi/>
+        <w:spacing w:before="360" w:after="120" w:line="300"/>
+        <w:jc w:val="right"/>
+      </w:pPr>
+      <w:r>
+        <w:rPr>
+          <w:b/>
+          <w:bCs/>
+          <w:color w:val="1F3FA8"/>
+          <w:sz w:val="34"/>
+          <w:szCs w:val="34"/>
+          <w:rtl/>
+          <w:rFonts w:ascii="Arial" w:cs="Arial" w:eastAsia="Arial" w:hAnsi="Arial"/>
+        </w:rPr>
+        <w:t xml:space="preserve">עמוד 4: טקסטים שעדיין חסרים (הצעות לכתיבה)</w:t>
+      </w:r>
+    </w:p>
+    <w:p>
+      <w:pPr>
+        <w:bidi/>
+        <w:spacing w:before="60" w:after="120" w:line="300"/>
+        <w:jc w:val="right"/>
+      </w:pPr>
+      <w:r>
+        <w:rPr>
+          <w:i/>
+          <w:iCs/>
+          <w:color w:val="6B6560"/>
+          <w:sz w:val="19"/>
+          <w:szCs w:val="19"/>
+          <w:rtl/>
+          <w:rFonts w:ascii="Arial" w:cs="Arial" w:eastAsia="Arial" w:hAnsi="Arial"/>
+        </w:rPr>
+        <w:t xml:space="preserve">אזורים שלא קיימים באתר ושווה לכתוב להם טקסט. הוכחה חברתית היא החוסר המשמעותי ביותר כרגע.</w:t>
+      </w:r>
+    </w:p>
+    <w:tbl>
+      <w:tblPr>
+        <w:bidiVisual/>
+        <w:tblW w:type="pct" w:w="100%"/>
+        <w:tblBorders>
+          <w:top w:val="single" w:color="auto" w:sz="4"/>
+          <w:left w:val="single" w:color="auto" w:sz="4"/>
+          <w:bottom w:val="single" w:color="auto" w:sz="4"/>
+          <w:right w:val="single" w:color="auto" w:sz="4"/>
+          <w:insideH w:val="single" w:color="auto" w:sz="4"/>
+          <w:insideV w:val="single" w:color="auto" w:sz="4"/>
+        </w:tblBorders>
+      </w:tblPr>
+      <w:tblGrid>
+        <w:gridCol w:w="100"/>
+        <w:gridCol w:w="100"/>
+        <w:gridCol w:w="100"/>
+      </w:tblGrid>
+      <w:tr>
+        <w:trPr>
+          <w:tblHeader/>
+        </w:trPr>
+        <w:tc>
+          <w:tcPr>
+            <w:tcW w:type="pct" w:w="22%"/>
+            <w:tcBorders>
+              <w:top w:val="single" w:color="D9D4C7" w:sz="4"/>
+              <w:left w:val="single" w:color="D9D4C7" w:sz="4"/>
+              <w:bottom w:val="single" w:color="D9D4C7" w:sz="4"/>
+              <w:right w:val="single" w:color="D9D4C7" w:sz="4"/>
+            </w:tcBorders>
+            <w:shd w:fill="F1EFE9" w:val="clear"/>
+            <w:tcMar>
+              <w:top w:type="dxa" w:w="80"/>
+              <w:left w:type="dxa" w:w="120"/>
+              <w:bottom w:type="dxa" w:w="80"/>
+              <w:right w:type="dxa" w:w="120"/>
+            </w:tcMar>
+          </w:tcPr>
+          <w:p>
+            <w:pPr>
+              <w:bidi/>
+              <w:spacing w:before="0" w:after="0" w:line="300"/>
+              <w:jc w:val="right"/>
+            </w:pPr>
+            <w:r>
+              <w:rPr>
+                <w:b/>
+                <w:bCs/>
+                <w:color w:val="1F3FA8"/>
+                <w:sz w:val="20"/>
+                <w:szCs w:val="20"/>
+                <w:rtl/>
+                <w:rFonts w:ascii="Arial" w:cs="Arial" w:eastAsia="Arial" w:hAnsi="Arial"/>
+              </w:rPr>
+              <w:t xml:space="preserve">אלמנט</w:t>
+            </w:r>
+          </w:p>
+        </w:tc>
+        <w:tc>
+          <w:tcPr>
+            <w:tcW w:type="pct" w:w="50%"/>
+            <w:tcBorders>
+              <w:top w:val="single" w:color="D9D4C7" w:sz="4"/>
+              <w:left w:val="single" w:color="D9D4C7" w:sz="4"/>
+              <w:bottom w:val="single" w:color="D9D4C7" w:sz="4"/>
+              <w:right w:val="single" w:color="D9D4C7" w:sz="4"/>
+            </w:tcBorders>
+            <w:shd w:fill="F1EFE9" w:val="clear"/>
+            <w:tcMar>
+              <w:top w:type="dxa" w:w="80"/>
+              <w:left w:type="dxa" w:w="120"/>
+              <w:bottom w:type="dxa" w:w="80"/>
+              <w:right w:type="dxa" w:w="120"/>
+            </w:tcMar>
+          </w:tcPr>
+          <w:p>
+            <w:pPr>
+              <w:bidi/>
+              <w:spacing w:before="0" w:after="0" w:line="300"/>
+              <w:jc w:val="right"/>
+            </w:pPr>
+            <w:r>
+              <w:rPr>
+                <w:b/>
+                <w:bCs/>
+                <w:color w:val="1F3FA8"/>
+                <w:sz w:val="20"/>
+                <w:szCs w:val="20"/>
+                <w:rtl/>
+                <w:rFonts w:ascii="Arial" w:cs="Arial" w:eastAsia="Arial" w:hAnsi="Arial"/>
+              </w:rPr>
+              <w:t xml:space="preserve">הטקסט באתר</w:t>
+            </w:r>
+          </w:p>
+        </w:tc>
+        <w:tc>
+          <w:tcPr>
+            <w:tcW w:type="pct" w:w="28%"/>
+            <w:tcBorders>
+              <w:top w:val="single" w:color="D9D4C7" w:sz="4"/>
+              <w:left w:val="single" w:color="D9D4C7" w:sz="4"/>
+              <w:bottom w:val="single" w:color="D9D4C7" w:sz="4"/>
+              <w:right w:val="single" w:color="D9D4C7" w:sz="4"/>
+            </w:tcBorders>
+            <w:shd w:fill="F1EFE9" w:val="clear"/>
+            <w:tcMar>
+              <w:top w:type="dxa" w:w="80"/>
+              <w:left w:type="dxa" w:w="120"/>
+              <w:bottom w:type="dxa" w:w="80"/>
+              <w:right w:type="dxa" w:w="120"/>
+            </w:tcMar>
+          </w:tcPr>
+          <w:p>
+            <w:pPr>
+              <w:bidi/>
+              <w:spacing w:before="0" w:after="0" w:line="300"/>
+              <w:jc w:val="right"/>
+            </w:pPr>
+            <w:r>
+              <w:rPr>
+                <w:b/>
+                <w:bCs/>
+                <w:color w:val="1F3FA8"/>
+                <w:sz w:val="20"/>
+                <w:szCs w:val="20"/>
+                <w:rtl/>
+                <w:rFonts w:ascii="Arial" w:cs="Arial" w:eastAsia="Arial" w:hAnsi="Arial"/>
+              </w:rPr>
+              <w:t xml:space="preserve">הערות ומגבלות</w:t>
+            </w:r>
+          </w:p>
+        </w:tc>
+      </w:tr>
+      <w:tr>
+        <w:tc>
+          <w:tcPr>
+            <w:tcW w:type="pct" w:w="22%"/>
+            <w:tcBorders>
+              <w:top w:val="single" w:color="D9D4C7" w:sz="4"/>
+              <w:left w:val="single" w:color="D9D4C7" w:sz="4"/>
+              <w:bottom w:val="single" w:color="D9D4C7" w:sz="4"/>
+              <w:right w:val="single" w:color="D9D4C7" w:sz="4"/>
+            </w:tcBorders>
+            <w:tcMar>
+              <w:top w:type="dxa" w:w="80"/>
+              <w:left w:type="dxa" w:w="120"/>
+              <w:bottom w:type="dxa" w:w="80"/>
+              <w:right w:type="dxa" w:w="120"/>
+            </w:tcMar>
+          </w:tcPr>
+          <w:p>
+            <w:pPr>
+              <w:bidi/>
+              <w:spacing w:before="0" w:after="0" w:line="300"/>
+              <w:jc w:val="right"/>
+            </w:pPr>
+            <w:r>
+              <w:rPr>
+                <w:color w:val="171512"/>
+                <w:sz w:val="21"/>
+                <w:szCs w:val="21"/>
+                <w:rtl/>
+                <w:rFonts w:ascii="Arial" w:cs="Arial" w:eastAsia="Arial" w:hAnsi="Arial"/>
+              </w:rPr>
+              <w:t xml:space="preserve">הוכחה חברתית</w:t>
+            </w:r>
+          </w:p>
+        </w:tc>
+        <w:tc>
+          <w:tcPr>
+            <w:tcW w:type="pct" w:w="50%"/>
+            <w:tcBorders>
+              <w:top w:val="single" w:color="D9D4C7" w:sz="4"/>
+              <w:left w:val="single" w:color="D9D4C7" w:sz="4"/>
+              <w:bottom w:val="single" w:color="D9D4C7" w:sz="4"/>
+              <w:right w:val="single" w:color="D9D4C7" w:sz="4"/>
+            </w:tcBorders>
+            <w:tcMar>
+              <w:top w:type="dxa" w:w="80"/>
+              <w:left w:type="dxa" w:w="120"/>
+              <w:bottom w:type="dxa" w:w="80"/>
+              <w:right w:type="dxa" w:w="120"/>
+            </w:tcMar>
+          </w:tcPr>
+          <w:p>
+            <w:pPr>
+              <w:bidi/>
+              <w:spacing w:before="0" w:after="0" w:line="300"/>
+              <w:jc w:val="right"/>
+            </w:pPr>
+            <w:r>
+              <w:rPr>
+                <w:color w:val="171512"/>
+                <w:sz w:val="21"/>
+                <w:szCs w:val="21"/>
+                <w:rtl/>
+                <w:rFonts w:ascii="Arial" w:cs="Arial" w:eastAsia="Arial" w:hAnsi="Arial"/>
+              </w:rPr>
+              <w:t xml:space="preserve">אין עדיין</w:t>
+            </w:r>
+          </w:p>
+        </w:tc>
+        <w:tc>
+          <w:tcPr>
+            <w:tcW w:type="pct" w:w="28%"/>
+            <w:tcBorders>
+              <w:top w:val="single" w:color="D9D4C7" w:sz="4"/>
+              <w:left w:val="single" w:color="D9D4C7" w:sz="4"/>
+              <w:bottom w:val="single" w:color="D9D4C7" w:sz="4"/>
+              <w:right w:val="single" w:color="D9D4C7" w:sz="4"/>
+            </w:tcBorders>
+            <w:tcMar>
+              <w:top w:type="dxa" w:w="80"/>
+              <w:left w:type="dxa" w:w="120"/>
+              <w:bottom w:type="dxa" w:w="80"/>
+              <w:right w:type="dxa" w:w="120"/>
+            </w:tcMar>
+          </w:tcPr>
+          <w:p>
+            <w:pPr>
+              <w:bidi/>
+              <w:spacing w:before="0" w:after="0" w:line="300"/>
+              <w:jc w:val="right"/>
+            </w:pPr>
+            <w:r>
+              <w:rPr>
+                <w:color w:val="171512"/>
+                <w:sz w:val="21"/>
+                <w:szCs w:val="21"/>
+                <w:rtl/>
+                <w:rFonts w:ascii="Arial" w:cs="Arial" w:eastAsia="Arial" w:hAnsi="Arial"/>
+              </w:rPr>
+              <w:t xml:space="preserve">3 עד 5 המלצות אמיתיות של לקוחות (2 עד 3 משפטים כל אחת) + שם פרטי ועיר. בלי המלצות אמיתיות לא נוסיף את האזור.</w:t>
+            </w:r>
+          </w:p>
+        </w:tc>
+      </w:tr>
+      <w:tr>
+        <w:tc>
+          <w:tcPr>
+            <w:tcW w:type="pct" w:w="22%"/>
+            <w:tcBorders>
+              <w:top w:val="single" w:color="D9D4C7" w:sz="4"/>
+              <w:left w:val="single" w:color="D9D4C7" w:sz="4"/>
+              <w:bottom w:val="single" w:color="D9D4C7" w:sz="4"/>
+              <w:right w:val="single" w:color="D9D4C7" w:sz="4"/>
+            </w:tcBorders>
+            <w:tcMar>
+              <w:top w:type="dxa" w:w="80"/>
+              <w:left w:type="dxa" w:w="120"/>
+              <w:bottom w:type="dxa" w:w="80"/>
+              <w:right w:type="dxa" w:w="120"/>
+            </w:tcMar>
+          </w:tcPr>
+          <w:p>
+            <w:pPr>
+              <w:bidi/>
+              <w:spacing w:before="0" w:after="0" w:line="300"/>
+              <w:jc w:val="right"/>
+            </w:pPr>
+            <w:r>
+              <w:rPr>
+                <w:color w:val="171512"/>
+                <w:sz w:val="21"/>
+                <w:szCs w:val="21"/>
+                <w:rtl/>
+                <w:rFonts w:ascii="Arial" w:cs="Arial" w:eastAsia="Arial" w:hAnsi="Arial"/>
+              </w:rPr>
+              <w:t xml:space="preserve">שורת "מי אנחנו"</w:t>
+            </w:r>
+          </w:p>
+        </w:tc>
+        <w:tc>
+          <w:tcPr>
+            <w:tcW w:type="pct" w:w="50%"/>
+            <w:tcBorders>
+              <w:top w:val="single" w:color="D9D4C7" w:sz="4"/>
+              <w:left w:val="single" w:color="D9D4C7" w:sz="4"/>
+              <w:bottom w:val="single" w:color="D9D4C7" w:sz="4"/>
+              <w:right w:val="single" w:color="D9D4C7" w:sz="4"/>
+            </w:tcBorders>
+            <w:tcMar>
+              <w:top w:type="dxa" w:w="80"/>
+              <w:left w:type="dxa" w:w="120"/>
+              <w:bottom w:type="dxa" w:w="80"/>
+              <w:right w:type="dxa" w:w="120"/>
+            </w:tcMar>
+          </w:tcPr>
+          <w:p>
+            <w:pPr>
+              <w:bidi/>
+              <w:spacing w:before="0" w:after="0" w:line="300"/>
+              <w:jc w:val="right"/>
+            </w:pPr>
+            <w:r>
+              <w:rPr>
+                <w:color w:val="171512"/>
+                <w:sz w:val="21"/>
+                <w:szCs w:val="21"/>
+                <w:rtl/>
+                <w:rFonts w:ascii="Arial" w:cs="Arial" w:eastAsia="Arial" w:hAnsi="Arial"/>
+              </w:rPr>
+              <w:t xml:space="preserve">אין עדיין</w:t>
+            </w:r>
+          </w:p>
+        </w:tc>
+        <w:tc>
+          <w:tcPr>
+            <w:tcW w:type="pct" w:w="28%"/>
+            <w:tcBorders>
+              <w:top w:val="single" w:color="D9D4C7" w:sz="4"/>
+              <w:left w:val="single" w:color="D9D4C7" w:sz="4"/>
+              <w:bottom w:val="single" w:color="D9D4C7" w:sz="4"/>
+              <w:right w:val="single" w:color="D9D4C7" w:sz="4"/>
+            </w:tcBorders>
+            <w:tcMar>
+              <w:top w:type="dxa" w:w="80"/>
+              <w:left w:type="dxa" w:w="120"/>
+              <w:bottom w:type="dxa" w:w="80"/>
+              <w:right w:type="dxa" w:w="120"/>
+            </w:tcMar>
+          </w:tcPr>
+          <w:p>
+            <w:pPr>
+              <w:bidi/>
+              <w:spacing w:before="0" w:after="0" w:line="300"/>
+              <w:jc w:val="right"/>
+            </w:pPr>
+            <w:r>
+              <w:rPr>
+                <w:color w:val="171512"/>
+                <w:sz w:val="21"/>
+                <w:szCs w:val="21"/>
+                <w:rtl/>
+                <w:rFonts w:ascii="Arial" w:cs="Arial" w:eastAsia="Arial" w:hAnsi="Arial"/>
+              </w:rPr>
+              <w:t xml:space="preserve">2 עד 3 משפטים: מי מייבא, למה דווקא המוצר הזה, מה הסיפור מתאילנד. מחזק אמון באתר של מוצר בודד.</w:t>
+            </w:r>
+          </w:p>
+        </w:tc>
+      </w:tr>
+      <w:tr>
+        <w:tc>
+          <w:tcPr>
+            <w:tcW w:type="pct" w:w="22%"/>
+            <w:tcBorders>
+              <w:top w:val="single" w:color="D9D4C7" w:sz="4"/>
+              <w:left w:val="single" w:color="D9D4C7" w:sz="4"/>
+              <w:bottom w:val="single" w:color="D9D4C7" w:sz="4"/>
+              <w:right w:val="single" w:color="D9D4C7" w:sz="4"/>
+            </w:tcBorders>
+            <w:tcMar>
+              <w:top w:type="dxa" w:w="80"/>
+              <w:left w:type="dxa" w:w="120"/>
+              <w:bottom w:type="dxa" w:w="80"/>
+              <w:right w:type="dxa" w:w="120"/>
+            </w:tcMar>
+          </w:tcPr>
+          <w:p>
+            <w:pPr>
+              <w:bidi/>
+              <w:spacing w:before="0" w:after="0" w:line="300"/>
+              <w:jc w:val="right"/>
+            </w:pPr>
+            <w:r>
+              <w:rPr>
+                <w:color w:val="171512"/>
+                <w:sz w:val="21"/>
+                <w:szCs w:val="21"/>
+                <w:rtl/>
+                <w:rFonts w:ascii="Arial" w:cs="Arial" w:eastAsia="Arial" w:hAnsi="Arial"/>
+              </w:rPr>
+              <w:t xml:space="preserve">אחריות / החזרות</w:t>
+            </w:r>
+          </w:p>
+        </w:tc>
+        <w:tc>
+          <w:tcPr>
+            <w:tcW w:type="pct" w:w="50%"/>
+            <w:tcBorders>
+              <w:top w:val="single" w:color="D9D4C7" w:sz="4"/>
+              <w:left w:val="single" w:color="D9D4C7" w:sz="4"/>
+              <w:bottom w:val="single" w:color="D9D4C7" w:sz="4"/>
+              <w:right w:val="single" w:color="D9D4C7" w:sz="4"/>
+            </w:tcBorders>
+            <w:tcMar>
+              <w:top w:type="dxa" w:w="80"/>
+              <w:left w:type="dxa" w:w="120"/>
+              <w:bottom w:type="dxa" w:w="80"/>
+              <w:right w:type="dxa" w:w="120"/>
+            </w:tcMar>
+          </w:tcPr>
+          <w:p>
+            <w:pPr>
+              <w:bidi/>
+              <w:spacing w:before="0" w:after="0" w:line="300"/>
+              <w:jc w:val="right"/>
+            </w:pPr>
+            <w:r>
+              <w:rPr>
+                <w:color w:val="171512"/>
+                <w:sz w:val="21"/>
+                <w:szCs w:val="21"/>
+                <w:rtl/>
+                <w:rFonts w:ascii="Arial" w:cs="Arial" w:eastAsia="Arial" w:hAnsi="Arial"/>
+              </w:rPr>
+              <w:t xml:space="preserve">אין עדיין</w:t>
+            </w:r>
+          </w:p>
+        </w:tc>
+        <w:tc>
+          <w:tcPr>
+            <w:tcW w:type="pct" w:w="28%"/>
+            <w:tcBorders>
+              <w:top w:val="single" w:color="D9D4C7" w:sz="4"/>
+              <w:left w:val="single" w:color="D9D4C7" w:sz="4"/>
+              <w:bottom w:val="single" w:color="D9D4C7" w:sz="4"/>
+              <w:right w:val="single" w:color="D9D4C7" w:sz="4"/>
+            </w:tcBorders>
+            <w:tcMar>
+              <w:top w:type="dxa" w:w="80"/>
+              <w:left w:type="dxa" w:w="120"/>
+              <w:bottom w:type="dxa" w:w="80"/>
+              <w:right w:type="dxa" w:w="120"/>
+            </w:tcMar>
+          </w:tcPr>
+          <w:p>
+            <w:pPr>
+              <w:bidi/>
+              <w:spacing w:before="0" w:after="0" w:line="300"/>
+              <w:jc w:val="right"/>
+            </w:pPr>
+            <w:r>
+              <w:rPr>
+                <w:color w:val="171512"/>
+                <w:sz w:val="21"/>
+                <w:szCs w:val="21"/>
+                <w:rtl/>
+                <w:rFonts w:ascii="Arial" w:cs="Arial" w:eastAsia="Arial" w:hAnsi="Arial"/>
+              </w:rPr>
+              <w:t xml:space="preserve">משפט אחד ברור על מדיניות החזרה. מוריד סיכון בדיוק לפני הכפתור. צריך אישור של איציק.</w:t>
+            </w:r>
+          </w:p>
+        </w:tc>
+      </w:tr>
+      <w:tr>
+        <w:tc>
+          <w:tcPr>
+            <w:tcW w:type="pct" w:w="22%"/>
+            <w:tcBorders>
+              <w:top w:val="single" w:color="D9D4C7" w:sz="4"/>
+              <w:left w:val="single" w:color="D9D4C7" w:sz="4"/>
+              <w:bottom w:val="single" w:color="D9D4C7" w:sz="4"/>
+              <w:right w:val="single" w:color="D9D4C7" w:sz="4"/>
+            </w:tcBorders>
+            <w:tcMar>
+              <w:top w:type="dxa" w:w="80"/>
+              <w:left w:type="dxa" w:w="120"/>
+              <w:bottom w:type="dxa" w:w="80"/>
+              <w:right w:type="dxa" w:w="120"/>
+            </w:tcMar>
+          </w:tcPr>
+          <w:p>
+            <w:pPr>
+              <w:bidi/>
+              <w:spacing w:before="0" w:after="0" w:line="300"/>
+              <w:jc w:val="right"/>
+            </w:pPr>
+            <w:r>
+              <w:rPr>
+                <w:color w:val="171512"/>
+                <w:sz w:val="21"/>
+                <w:szCs w:val="21"/>
+                <w:rtl/>
+                <w:rFonts w:ascii="Arial" w:cs="Arial" w:eastAsia="Arial" w:hAnsi="Arial"/>
+              </w:rPr>
+              <w:t xml:space="preserve">זמן חזרה מוגדר</w:t>
+            </w:r>
+          </w:p>
+        </w:tc>
+        <w:tc>
+          <w:tcPr>
+            <w:tcW w:type="pct" w:w="50%"/>
+            <w:tcBorders>
+              <w:top w:val="single" w:color="D9D4C7" w:sz="4"/>
+              <w:left w:val="single" w:color="D9D4C7" w:sz="4"/>
+              <w:bottom w:val="single" w:color="D9D4C7" w:sz="4"/>
+              <w:right w:val="single" w:color="D9D4C7" w:sz="4"/>
+            </w:tcBorders>
+            <w:tcMar>
+              <w:top w:type="dxa" w:w="80"/>
+              <w:left w:type="dxa" w:w="120"/>
+              <w:bottom w:type="dxa" w:w="80"/>
+              <w:right w:type="dxa" w:w="120"/>
+            </w:tcMar>
+          </w:tcPr>
+          <w:p>
+            <w:pPr>
+              <w:bidi/>
+              <w:spacing w:before="0" w:after="0" w:line="300"/>
+              <w:jc w:val="right"/>
+            </w:pPr>
+            <w:r>
+              <w:rPr>
+                <w:color w:val="171512"/>
+                <w:sz w:val="21"/>
+                <w:szCs w:val="21"/>
+                <w:rtl/>
+                <w:rFonts w:ascii="Arial" w:cs="Arial" w:eastAsia="Arial" w:hAnsi="Arial"/>
+              </w:rPr>
+              <w:t xml:space="preserve">אין עדיין</w:t>
+            </w:r>
+          </w:p>
+        </w:tc>
+        <w:tc>
+          <w:tcPr>
+            <w:tcW w:type="pct" w:w="28%"/>
+            <w:tcBorders>
+              <w:top w:val="single" w:color="D9D4C7" w:sz="4"/>
+              <w:left w:val="single" w:color="D9D4C7" w:sz="4"/>
+              <w:bottom w:val="single" w:color="D9D4C7" w:sz="4"/>
+              <w:right w:val="single" w:color="D9D4C7" w:sz="4"/>
+            </w:tcBorders>
+            <w:tcMar>
+              <w:top w:type="dxa" w:w="80"/>
+              <w:left w:type="dxa" w:w="120"/>
+              <w:bottom w:type="dxa" w:w="80"/>
+              <w:right w:type="dxa" w:w="120"/>
+            </w:tcMar>
+          </w:tcPr>
+          <w:p>
+            <w:pPr>
+              <w:bidi/>
+              <w:spacing w:before="0" w:after="0" w:line="300"/>
+              <w:jc w:val="right"/>
+            </w:pPr>
+            <w:r>
+              <w:rPr>
+                <w:color w:val="171512"/>
+                <w:sz w:val="21"/>
+                <w:szCs w:val="21"/>
+                <w:rtl/>
+                <w:rFonts w:ascii="Arial" w:cs="Arial" w:eastAsia="Arial" w:hAnsi="Arial"/>
+              </w:rPr>
+              <w:t xml:space="preserve">אם אפשר להתחייב ל"חוזרים אליכם היום", זה שווה שיפור המרה משמעותי. להוסיף בהודעת ההצלחה ובאותיות הקטנות.</w:t>
+            </w:r>
+          </w:p>
+        </w:tc>
+      </w:tr>
+      <w:tr>
+        <w:tc>
+          <w:tcPr>
+            <w:tcW w:type="pct" w:w="22%"/>
+            <w:tcBorders>
+              <w:top w:val="single" w:color="D9D4C7" w:sz="4"/>
+              <w:left w:val="single" w:color="D9D4C7" w:sz="4"/>
+              <w:bottom w:val="single" w:color="D9D4C7" w:sz="4"/>
+              <w:right w:val="single" w:color="D9D4C7" w:sz="4"/>
+            </w:tcBorders>
+            <w:tcMar>
+              <w:top w:type="dxa" w:w="80"/>
+              <w:left w:type="dxa" w:w="120"/>
+              <w:bottom w:type="dxa" w:w="80"/>
+              <w:right w:type="dxa" w:w="120"/>
+            </w:tcMar>
+          </w:tcPr>
+          <w:p>
+            <w:pPr>
+              <w:bidi/>
+              <w:spacing w:before="0" w:after="0" w:line="300"/>
+              <w:jc w:val="right"/>
+            </w:pPr>
+            <w:r>
+              <w:rPr>
+                <w:color w:val="171512"/>
+                <w:sz w:val="21"/>
+                <w:szCs w:val="21"/>
+                <w:rtl/>
+                <w:rFonts w:ascii="Arial" w:cs="Arial" w:eastAsia="Arial" w:hAnsi="Arial"/>
+              </w:rPr>
+              <w:t xml:space="preserve">ביו לאינסטגרם</w:t>
+            </w:r>
+          </w:p>
+        </w:tc>
+        <w:tc>
+          <w:tcPr>
+            <w:tcW w:type="pct" w:w="50%"/>
+            <w:tcBorders>
+              <w:top w:val="single" w:color="D9D4C7" w:sz="4"/>
+              <w:left w:val="single" w:color="D9D4C7" w:sz="4"/>
+              <w:bottom w:val="single" w:color="D9D4C7" w:sz="4"/>
+              <w:right w:val="single" w:color="D9D4C7" w:sz="4"/>
+            </w:tcBorders>
+            <w:tcMar>
+              <w:top w:type="dxa" w:w="80"/>
+              <w:left w:type="dxa" w:w="120"/>
+              <w:bottom w:type="dxa" w:w="80"/>
+              <w:right w:type="dxa" w:w="120"/>
+            </w:tcMar>
+          </w:tcPr>
+          <w:p>
+            <w:pPr>
+              <w:bidi/>
+              <w:spacing w:before="0" w:after="0" w:line="300"/>
+              <w:jc w:val="right"/>
+            </w:pPr>
+            <w:r>
+              <w:rPr>
+                <w:color w:val="171512"/>
+                <w:sz w:val="21"/>
+                <w:szCs w:val="21"/>
+                <w:rtl/>
+                <w:rFonts w:ascii="Arial" w:cs="Arial" w:eastAsia="Arial" w:hAnsi="Arial"/>
+              </w:rPr>
+              <w:t xml:space="preserve">אין עדיין</w:t>
+            </w:r>
+          </w:p>
+        </w:tc>
+        <w:tc>
+          <w:tcPr>
+            <w:tcW w:type="pct" w:w="28%"/>
+            <w:tcBorders>
+              <w:top w:val="single" w:color="D9D4C7" w:sz="4"/>
+              <w:left w:val="single" w:color="D9D4C7" w:sz="4"/>
+              <w:bottom w:val="single" w:color="D9D4C7" w:sz="4"/>
+              <w:right w:val="single" w:color="D9D4C7" w:sz="4"/>
+            </w:tcBorders>
+            <w:tcMar>
+              <w:top w:type="dxa" w:w="80"/>
+              <w:left w:type="dxa" w:w="120"/>
+              <w:bottom w:type="dxa" w:w="80"/>
+              <w:right w:type="dxa" w:w="120"/>
+            </w:tcMar>
+          </w:tcPr>
+          <w:p>
+            <w:pPr>
+              <w:bidi/>
+              <w:spacing w:before="0" w:after="0" w:line="300"/>
+              <w:jc w:val="right"/>
+            </w:pPr>
+            <w:r>
+              <w:rPr>
+                <w:color w:val="171512"/>
+                <w:sz w:val="21"/>
+                <w:szCs w:val="21"/>
+                <w:rtl/>
+                <w:rFonts w:ascii="Arial" w:cs="Arial" w:eastAsia="Arial" w:hAnsi="Arial"/>
+              </w:rPr>
+              <w:t xml:space="preserve">עד 150 תווים, עם קריאה לפעולה לאתר.</w:t>
+            </w:r>
+          </w:p>
+        </w:tc>
+      </w:tr>
+      <w:tr>
+        <w:tc>
+          <w:tcPr>
+            <w:tcW w:type="pct" w:w="22%"/>
+            <w:tcBorders>
+              <w:top w:val="single" w:color="D9D4C7" w:sz="4"/>
+              <w:left w:val="single" w:color="D9D4C7" w:sz="4"/>
+              <w:bottom w:val="single" w:color="D9D4C7" w:sz="4"/>
+              <w:right w:val="single" w:color="D9D4C7" w:sz="4"/>
+            </w:tcBorders>
+            <w:tcMar>
+              <w:top w:type="dxa" w:w="80"/>
+              <w:left w:type="dxa" w:w="120"/>
+              <w:bottom w:type="dxa" w:w="80"/>
+              <w:right w:type="dxa" w:w="120"/>
+            </w:tcMar>
+          </w:tcPr>
+          <w:p>
+            <w:pPr>
+              <w:bidi/>
+              <w:spacing w:before="0" w:after="0" w:line="300"/>
+              <w:jc w:val="right"/>
+            </w:pPr>
+            <w:r>
+              <w:rPr>
+                <w:color w:val="171512"/>
+                <w:sz w:val="21"/>
+                <w:szCs w:val="21"/>
+                <w:rtl/>
+                <w:rFonts w:ascii="Arial" w:cs="Arial" w:eastAsia="Arial" w:hAnsi="Arial"/>
+              </w:rPr>
               <w:t xml:space="preserve">הודעת נטישה</w:t>
             </w:r>
           </w:p>
@@ -15135,7 +16305,7 @@
                 <w:rtl/>
                 <w:rFonts w:ascii="Arial" w:cs="Arial" w:eastAsia="Arial" w:hAnsi="Arial"/>
               </w:rPr>
-              <w:t xml:space="preserve">הודעת וואטסאפ ללקוח שמילא טופס ולא שילם אחרי יומיים. קצרה, לא לוחצת.</w:t>
+              <w:t xml:space="preserve">הודעת וואטסאפ למי שמילא טופס ולא שילם אחרי יומיים. קצרה, בלי לחץ, עם תזכורת לערך.</w:t>
             </w:r>
           </w:p>
         </w:tc>

</xml_diff>